<commit_message>
Expand and verify references: 36 sources incl. 8 new 2026 works
- Independently re-verified every citation's authorship, venue, year, DOI
- Corrected key errors: AIPatient first author (Yu, not Liu), LLM Agents
  for Education (Chu et al., not Yang), JCAL meta-analysis (Liu Z. et al.),
  full author lists + DOIs for Kestin, Bastani, Fan, Kosmyna, World Bank,
  Khanmigo, Sapkota (Information Fusion), retraction note
- Added 8 verified 2026 sources (meta-analyses, governance, equity, risks)
- Excluded 5 candidate sources whose authorship could not be confirmed
- Softened OECD paraphrase; resolved all dangling citations

https://claude.ai/code/session_01YW6bjEw6DSrD5H7JmH8dwe
</commit_message>
<xml_diff>
--- a/Agentic-AI-in-Education-Narrative-Review.docx
+++ b/Agentic-AI-in-Education-Narrative-Review.docx
@@ -390,7 +390,7 @@
         <w:rPr>
           <w:rFonts w:ascii="Times New Roman" w:cs="Times New Roman" w:eastAsia="Times New Roman" w:hAnsi="Times New Roman"/>
         </w:rPr>
-        <w:t xml:space="preserve">To mitigate the risk of citing fabricated or misattributed findings—a documented hazard when AI-assisted tooling supports literature retrieval—twelve load-bearing empirical claims were subjected to a three-vote adversarial verification protocol. Each claim was independently re-checked by three separate verification passes that actively sought to refute it (confirming source existence, authorship, journal, date, sample size, and reported effect). A claim was retained only if it survived this scrutiny; a claim was rejected if it failed two of three checks. Of the twelve claims examined, eleven were confirmed and one was rejected: a circulating set of disparity statistics (“146 implementations; 57% disparities; 14.7% lower predictive accuracy”) was traced to a legitimate DOI whose actual content (a qualitative review of approximately seventy-five papers) did not contain those figures, and was therefore excluded. Claims that could not be fully verified are reported with explicit hedging.</w:t>
+        <w:t xml:space="preserve">To mitigate the risk of citing fabricated or misattributed findings—a documented hazard when AI-assisted tooling supports literature retrieval—twelve load-bearing empirical claims were subjected to a three-vote adversarial verification protocol. Each claim was independently re-checked by three separate verification passes that actively sought to refute it (confirming source existence, authorship, journal, date, sample size, and reported effect). A claim was retained only if it survived this scrutiny; a claim was rejected if it failed two of three checks. Of the twelve claims examined, eleven were confirmed and one was rejected: a circulating set of disparity statistics (“146 implementations; 57% disparities; 14.7% lower predictive accuracy”) was traced to a legitimate DOI whose actual content (a qualitative review of approximately seventy-five papers) did not contain those figures, and was therefore excluded. Claims that could not be fully verified are reported with explicit hedging. In a subsequent pass, the bibliographic details of every cited reference (authorship, venue, year, and identifier) were independently re-checked against scholarly indexes; corrections were applied where discrepancies were found, and candidate sources whose authorship could not be confirmed were excluded rather than cited speculatively.</w:t>
       </w:r>
     </w:p>
     <w:p>
@@ -463,7 +463,7 @@
         <w:rPr>
           <w:rFonts w:ascii="Times New Roman" w:cs="Times New Roman" w:eastAsia="Times New Roman" w:hAnsi="Times New Roman"/>
         </w:rPr>
-        <w:t xml:space="preserve">Education-specific frameworks are emerging but remain unstandardised. The APCP framework charts four escalating levels of agency in collaborative learning—AI as Adaptive Instrument, Proactive Assistant, Co-Learner, and Peer Collaborator—grounded in sociocultural and computer-supported collaborative learning (CSCL) theory (Yan, 2025). A complementary task-centric taxonomy divides educational large language model (LLM) agents into teaching-assistance and student-support agents over a shared architecture of perception, profiling, memory, reasoning, and action (Yang et al., 2025). General-purpose levels-of-autonomy scales (L0–L5) exist but are not education-specific (Levels of Autonomy for AI Agents, 2025).</w:t>
+        <w:t xml:space="preserve">Education-specific frameworks are emerging but remain unstandardised. The APCP framework charts four escalating levels of agency in collaborative learning—AI as Adaptive Instrument, Proactive Assistant, Co-Learner, and Peer Collaborator—grounded in sociocultural and computer-supported collaborative learning (CSCL) theory (Yan, 2025). A complementary task-centric taxonomy divides educational large language model (LLM) agents into teaching-assistance and student-support agents over a shared architecture of perception, profiling, memory, reasoning, and action (Chu et al., 2025). General-purpose levels-of-autonomy scales (L0–L5) exist but are not education-specific (Levels of Autonomy for AI Agents, 2025).</w:t>
       </w:r>
     </w:p>
     <w:p>
@@ -513,7 +513,7 @@
         <w:rPr>
           <w:rFonts w:ascii="Times New Roman" w:cs="Times New Roman" w:eastAsia="Times New Roman" w:hAnsi="Times New Roman"/>
         </w:rPr>
-        <w:t xml:space="preserve">Synthesis across the deployment literature identifies six recurrent pedagogical roles, summarised in Table 1.</w:t>
+        <w:t xml:space="preserve">Synthesis across the deployment literature identifies six recurrent pedagogical roles, summarised in Table 1. Beyond the functional role a system occupies, its perceived agency also shapes learner psychology: a 2026 study found that students’ perceptions of AI agency, together with trust and autonomy support, predicted self-efficacy and self-learning motivation in higher education (Alqurni, 2026).</w:t>
       </w:r>
     </w:p>
     <w:tbl>
@@ -1287,7 +1287,7 @@
         <w:rPr>
           <w:rFonts w:ascii="Times New Roman" w:cs="Times New Roman" w:eastAsia="Times New Roman" w:hAnsi="Times New Roman"/>
         </w:rPr>
-        <w:t xml:space="preserve">Khanmigo (Khan Academy) is the most widely deployed autonomous tutor, yet peer-reviewed evidence is mixed: a controlled study (n = 69 undergraduates) found learning gains but no statistically significant advantage over search-based and paper-only comparison groups, despite positive student ratings of its Socratic guidance (Journal of Teaching and Learning, 2025). The most robust teaching-assistant evidence concerns Jill Watson, a retrieval-augmented virtual assistant that achieved 75–97% accuracy on synthetic test sets (78.7% in live classrooms) against approximately 30% for an unaugmented baseline; classes using it earned more A grades (66% vs. 62%) and fewer C grades (3% vs. 7%) in an A/B comparison (Georgia Tech Research News, 2025).</w:t>
+        <w:t xml:space="preserve">Khanmigo (Khan Academy) is the most widely deployed autonomous tutor, yet peer-reviewed evidence is mixed: a controlled study (n = 69 undergraduates) found learning gains but no statistically significant advantage over search-based and paper-only comparison groups, despite positive student ratings of its Socratic guidance (Slijepcevic &amp; Yaylali, 2025). The most robust teaching-assistant evidence concerns Jill Watson, a retrieval-augmented virtual assistant that achieved 75–97% accuracy on synthetic test sets (78.7% in live classrooms) against approximately 30% for an unaugmented baseline; classes using it earned more A grades (66% vs. 62%) and fewer C grades (3% vs. 7%) in an A/B comparison (Georgia Institute of Technology, 2025).</w:t>
       </w:r>
     </w:p>
     <w:p>
@@ -1318,7 +1318,7 @@
         <w:rPr>
           <w:rFonts w:ascii="Times New Roman" w:cs="Times New Roman" w:eastAsia="Times New Roman" w:hAnsi="Times New Roman"/>
         </w:rPr>
-        <w:t xml:space="preserve">Simulated-peer systems such as OnlineMate employ Theory-of-Mind reasoning to adapt to learners’ cognitive and affective states (OnlineMate, 2025), while multi-agent orchestrators (EduPlanner; AgentLesson; the KLI-grounded MAS-CMD) generate and iteratively refine instructional designs. Notably, teachers strongly preferred MAS-CMD outputs as more creative and classroom-ready even though rubric scores differed only marginally from baselines (Stanford SCALE, 2025)—a caution that human preference is not equivalent to measured instructional quality. The strongest rigorous deployment evidence lies in medical simulation: AIPatient, driven by six task-specific LLM agents over a knowledge graph, matched or exceeded human standardised patients in a paired crossover study with medical students (Communications Medicine, 2025).</w:t>
+        <w:t xml:space="preserve">Simulated-peer systems such as OnlineMate employ Theory-of-Mind reasoning to adapt to learners’ cognitive and affective states (OnlineMate, 2025), while multi-agent orchestrators (EduPlanner; AgentLesson; the KLI-grounded MAS-CMD) generate and iteratively refine instructional designs. Notably, teachers strongly preferred MAS-CMD outputs as more creative and classroom-ready even though rubric scores differed only marginally from baselines (Stanford SCALE Initiative, 2025)—a caution that human preference is not equivalent to measured instructional quality. The strongest rigorous deployment evidence lies in medical simulation: AIPatient, driven by six task-specific LLM agents over a knowledge graph, matched or exceeded human standardised patients in a paired crossover study with medical students (Yu et al., 2025).</w:t>
       </w:r>
     </w:p>
     <w:p>
@@ -1800,25 +1800,7 @@
         <w:rPr>
           <w:rFonts w:ascii="Times New Roman" w:cs="Times New Roman" w:eastAsia="Times New Roman" w:hAnsi="Times New Roman"/>
         </w:rPr>
-        <w:t xml:space="preserve">These positive findings carry important hedges: the Kestin et al. (2025) tutoring lesson was researcher-engineered for best-case prompting over short single topics; the World Bank (2025) “1.5–2 years of schooling” equivalence is an extrapolation; and both ran in teacher-mentored rather than fully autonomous settings.</w:t>
-      </w:r>
-    </w:p>
-    <w:p>
-      <w:pPr>
-        <w:pStyle w:val="Heading2"/>
-        <w:spacing w:after="100" w:before="200"/>
-      </w:pPr>
-      <w:r>
-        <w:rPr>
-          <w:rFonts w:ascii="Times New Roman" w:cs="Times New Roman" w:eastAsia="Times New Roman" w:hAnsi="Times New Roman"/>
-          <w:b/>
-          <w:bCs/>
-          <w:i/>
-          <w:iCs/>
-          <w:sz w:val="24"/>
-          <w:szCs w:val="24"/>
-        </w:rPr>
-        <w:t xml:space="preserve">5.1 Over-reliance and the erosion of durable learning</w:t>
+        <w:t xml:space="preserve">These positive findings carry important hedges: the Kestin et al. (2025) tutoring lesson was researcher-engineered for best-case prompting over short single topics; the Nigeria trial’s (De Simone et al., 2025) “1.5–2 years of schooling” equivalence is an extrapolation; and both ran in teacher-mentored rather than fully autonomous settings.</w:t>
       </w:r>
     </w:p>
     <w:p>
@@ -1831,7 +1813,7 @@
         <w:rPr>
           <w:rFonts w:ascii="Times New Roman" w:cs="Times New Roman" w:eastAsia="Times New Roman" w:hAnsi="Times New Roman"/>
         </w:rPr>
-        <w:t xml:space="preserve">Countervailing evidence is equally rigorous. In a field randomised controlled trial in Turkish secondary mathematics, students using unguarded GPT-4 improved during practice but, once AI access was removed, scored approximately 17% worse on examinations than peers who never had access; critically, a guardrailed “tutor” variant that offered hints rather than answers eliminated this harm (Bastani et al., 2025). This provides the strongest causal evidence that the detriment is design-dependent rather than intrinsic. Convergent findings include reduced self-regulated learning and absent transfer gains despite better short-term essays (“metacognitive laziness”; Fan et al., 2025); superficial learning under over-reliance in 65.5% of fifty-eight programming-education studies (Teaching with AI, 2025); and a preprint EEG study in which LLM users showed the weakest neural connectivity and 83% could not quote from an essay they had just written (Kosmyna et al., 2025). The last is reported here as suggestive only, given its small sample (N = 54) and non-peer-reviewed status.</w:t>
+        <w:t xml:space="preserve">Convergent 2026 meta-analytic work situates the effect as moderate and, crucially, pedagogy-dependent. A meta-analysis confined to generative-AI pedagogical agents reported g = 0.401, with stronger effects under teacher-directed than self-directed learning (Cheng et al., 2026), while a meta-review synthesising prior systematic reviews reached similar conclusions about the centrality of instructional design (Zhang et al., 2026). A 2026 systematic review of higher education likewise reported mixed, discipline-dependent outcomes alongside engagement gains, reinforcing the call for longitudinal evidence (Hon, 2026). Taken together, these syntheses caution against headline point estimates and favour a range bounded by the conditions of use.</w:t>
       </w:r>
     </w:p>
     <w:p>
@@ -1849,7 +1831,7 @@
           <w:sz w:val="24"/>
           <w:szCs w:val="24"/>
         </w:rPr>
-        <w:t xml:space="preserve">5.2 Evidence quality and a cautionary retraction</w:t>
+        <w:t xml:space="preserve">5.1 Over-reliance and the erosion of durable learning</w:t>
       </w:r>
     </w:p>
     <w:p>
@@ -1862,7 +1844,38 @@
         <w:rPr>
           <w:rFonts w:ascii="Times New Roman" w:cs="Times New Roman" w:eastAsia="Times New Roman" w:hAnsi="Times New Roman"/>
         </w:rPr>
-        <w:t xml:space="preserve">Pooled effect sizes for generative AI in education range widely (g ≈ 0.46 to 1.14) across 2025–2026 meta-analyses, signalling heterogeneous, short-term, and frequently low-rigour primary studies alongside probable publication bias. Most strikingly, a heavily cited meta-analysis (originally reporting g = 0.867) was retracted in 2026 for data discrepancies after several hundred citations and approximately half a million reads (Retraction Note, 2026). Accordingly, the conservative peer-reviewed estimate (Liu et al., 2025; g ≈ 0.58) should be preferred, and effects reported as a range rather than a point value.</w:t>
+        <w:t xml:space="preserve">Countervailing evidence is equally rigorous. In a field randomised controlled trial in Turkish secondary mathematics, students using unguarded GPT-4 improved during practice but, once AI access was removed, scored approximately 17% worse on examinations than peers who never had access; critically, a guardrailed “tutor” variant that offered hints rather than answers eliminated this harm (Bastani et al., 2025). This provides the strongest causal evidence that the detriment is design-dependent rather than intrinsic. Convergent findings include reduced self-regulated learning and absent transfer gains despite better short-term essays (“metacognitive laziness”; Fan et al., 2025); superficial learning under over-reliance in 65.5% of fifty-eight programming-education studies (Teaching with AI, 2025); and a preprint EEG study in which LLM users showed the weakest neural connectivity and 83% could not quote from an essay they had just written (Kosmyna et al., 2025). The last is reported here as suggestive only, given its small sample (N = 54) and non-peer-reviewed status. Learner-side accounts corroborate the over-reliance mechanism: a 2026 thematic analysis found that students encountered fabricated citations and overconfident, sycophantic responses, and developed ad hoc verification strategies in response (Shoufan &amp; Esmaeil, 2026).</w:t>
+      </w:r>
+    </w:p>
+    <w:p>
+      <w:pPr>
+        <w:pStyle w:val="Heading2"/>
+        <w:spacing w:after="100" w:before="200"/>
+      </w:pPr>
+      <w:r>
+        <w:rPr>
+          <w:rFonts w:ascii="Times New Roman" w:cs="Times New Roman" w:eastAsia="Times New Roman" w:hAnsi="Times New Roman"/>
+          <w:b/>
+          <w:bCs/>
+          <w:i/>
+          <w:iCs/>
+          <w:sz w:val="24"/>
+          <w:szCs w:val="24"/>
+        </w:rPr>
+        <w:t xml:space="preserve">5.2 Evidence quality and a cautionary retraction</w:t>
+      </w:r>
+    </w:p>
+    <w:p>
+      <w:pPr>
+        <w:spacing w:after="120" w:line="360"/>
+        <w:ind w:firstLine="360"/>
+        <w:jc w:val="both"/>
+      </w:pPr>
+      <w:r>
+        <w:rPr>
+          <w:rFonts w:ascii="Times New Roman" w:cs="Times New Roman" w:eastAsia="Times New Roman" w:hAnsi="Times New Roman"/>
+        </w:rPr>
+        <w:t xml:space="preserve">Pooled effect sizes for generative AI in education range widely (g ≈ 0.46 to 1.14) across 2025–2026 meta-analyses, signalling heterogeneous, short-term, and frequently low-rigour primary studies alongside probable publication bias. Most strikingly, a heavily cited meta-analysis (Wang &amp; Fan, 2025, retracted; originally reporting g = 0.867) was retracted in 2026 for data discrepancies after several hundred citations and approximately half a million reads (Retraction note, 2026). Accordingly, the conservative peer-reviewed estimate (Liu et al., 2025; g ≈ 0.58) should be preferred, and effects reported as a range rather than a point value.</w:t>
       </w:r>
     </w:p>
     <w:p>
@@ -2431,7 +2444,7 @@
         <w:rPr>
           <w:rFonts w:ascii="Times New Roman" w:cs="Times New Roman" w:eastAsia="Times New Roman" w:hAnsi="Times New Roman"/>
         </w:rPr>
-        <w:t xml:space="preserve">When autonomous agents initiate and execute actions without a clearly designated human owner, responsibility diffuses across developers, deployers, and end-users—a “moral crumple zone” (Agentic AI: Autonomy, Accountability, and the Algorithmic Society, 2025). Critically, the strongest education-specific instruments (UNESCO, the EU AI Act, the OECD) were drafted for generative and predictive AI and predate the agentic framing, constituting a governance gap in itself.</w:t>
+        <w:t xml:space="preserve">When autonomous agents initiate and execute actions without a clearly designated human owner, responsibility diffuses across developers, deployers, and end-users—a “moral crumple zone” (Agentic AI, 2025). Critically, the strongest education-specific instruments (UNESCO, the EU AI Act, the OECD) were drafted for generative and predictive AI and predate the agentic framing, constituting a governance gap in itself.</w:t>
       </w:r>
     </w:p>
     <w:p>
@@ -2454,7 +2467,7 @@
         <w:rPr>
           <w:rFonts w:ascii="Times New Roman" w:cs="Times New Roman" w:eastAsia="Times New Roman" w:hAnsi="Times New Roman"/>
         </w:rPr>
-        <w:t xml:space="preserve">The OECD (2023) documents education algorithms biased against non-native-speaking and lower-socioeconomic students, and identifies a structural tension whereby detecting bias requires collecting the very demographic data one would prefer to minimise. (A widely circulated quantitative disparity statistic was found, on verification, to be misattributed and is deliberately omitted here; the underlying equity concern is nonetheless well documented.)</w:t>
+        <w:t xml:space="preserve">The OECD (2023) documents education algorithms that disadvantage societally marginalised groups—including along lines of language and socioeconomic status—and identifies a structural tension whereby detecting bias requires collecting the very demographic data one would prefer to minimise. (A widely circulated quantitative disparity statistic was found, on verification, to be misattributed to a paper that is in fact a qualitative synthesis of ethical risks (Zhu et al., 2025); the figure is therefore deliberately omitted here, although the underlying equity concern is well documented.)</w:t>
       </w:r>
     </w:p>
     <w:p>
@@ -2477,7 +2490,7 @@
         <w:rPr>
           <w:rFonts w:ascii="Times New Roman" w:cs="Times New Roman" w:eastAsia="Times New Roman" w:hAnsi="Times New Roman"/>
         </w:rPr>
-        <w:t xml:space="preserve">AI text detectors are unreliable—lagging new models, defeated by paraphrasers, and prone to false positives—prompting a scholarly shift toward assessment redesign (oral, in-person, and staged submission) over detection (MDPI Information, 2025). Data-protection regimes (FERPA, COPPA as amended in 2025, and the GDPR) remain fragmented and were written before autonomous, tool-using agents, while reported institutional trust in agentic AI is low—motivating tiered-autonomy safeguards and human-in-the-loop checkpoints.</w:t>
+        <w:t xml:space="preserve">AI text detectors are unreliable—lagging new models, defeated by paraphrasers, and prone to false positives—prompting a scholarly shift toward assessment redesign (oral, in-person, and staged submission) over detection (Bittle &amp; El-Gayar, 2025). Empirical 2026 evidence reinforces the concern: a stylistic and semantic analysis of student submissions found that many learners used AI to generate answers outright rather than as a support for learning (Logachev, 2026). Data-protection regimes (FERPA, COPPA as amended in 2025, and the GDPR) remain fragmented and were written before autonomous, tool-using agents, while reported institutional trust in agentic AI is low—motivating tiered-autonomy safeguards and human-in-the-loop checkpoints.</w:t>
       </w:r>
     </w:p>
     <w:p>
@@ -2506,7 +2519,7 @@
         <w:rPr>
           <w:rFonts w:ascii="Times New Roman" w:cs="Times New Roman" w:eastAsia="Times New Roman" w:hAnsi="Times New Roman"/>
         </w:rPr>
-        <w:t xml:space="preserve">Beyond formal governance, several cross-cutting risks recur. Errors in multi-step agent workflows propagate and compound, and even diagnosing which step failed is an unsolved evaluation problem (AgentHallu, 2026). The deskilling concern is reframed as “never-skilling,” whereby learners who route every task through AI fail to acquire foundational skills at all. Equity gaps persist and widened in 2025 (AI use of approximately 24.7% in the Global North vs. 14.1% in the Global South), compounded by the English-centric design of most tools (Frontiers in Computer Science, 2026). Developmental and mental-health risks—including asymmetric parasocial attachment among adolescents—are emerging and under-monitored (UNESCO, n.d.). Cross-institutional consensus favours augmentation over replacement of teachers, with teacher capability acting as the mediating variable between infrastructure investment and student AI literacy.</w:t>
+        <w:t xml:space="preserve">Beyond formal governance, several cross-cutting risks recur. Errors in multi-step agent workflows propagate and compound, and even diagnosing which step failed is an unsolved evaluation problem (Liu et al., 2026). The deskilling concern is reframed as “never-skilling,” whereby learners who route every task through AI fail to acquire foundational skills at all. Equity gaps persist and widened in 2025 (AI use of approximately 24.7% in the Global North vs. 14.1% in the Global South), compounded by the English-centric design of most tools and a “third-level” divide in who benefits from AI (Matjie et al., 2026). Developmental and mental-health risks—including asymmetric parasocial attachment among adolescents—are emerging and under-monitored (UNESCO, n.d.). Cross-institutional consensus favours augmentation over replacement of teachers, with teacher capability acting as the mediating variable between infrastructure investment and student AI literacy: a national multilevel analysis spanning over a thousand institutions found that teacher capability, rather than mere institutional readiness, mediated the path to student AI literacy (Guan et al., 2026).</w:t>
       </w:r>
     </w:p>
     <w:p>
@@ -2836,33 +2849,33 @@
           <w:sz w:val="20"/>
           <w:szCs w:val="20"/>
         </w:rPr>
-        <w:t xml:space="preserve">Bastani, H., Bastani, O., Sungu, A., Ge, H., Kabakcı, Ö., &amp; Mariman, R. (2025). Generative AI without guardrails can harm learning: Evidence from high school mathematics. </w:t>
-      </w:r>
-      <w:r>
-        <w:rPr>
-          <w:rFonts w:ascii="Times New Roman" w:cs="Times New Roman" w:eastAsia="Times New Roman" w:hAnsi="Times New Roman"/>
-          <w:i/>
-          <w:iCs/>
-          <w:sz w:val="20"/>
-          <w:szCs w:val="20"/>
-        </w:rPr>
-        <w:t xml:space="preserve">Proceedings of the National Academy of Sciences</w:t>
-      </w:r>
-      <w:r>
-        <w:rPr>
-          <w:rFonts w:ascii="Times New Roman" w:cs="Times New Roman" w:eastAsia="Times New Roman" w:hAnsi="Times New Roman"/>
-          <w:sz w:val="20"/>
-          <w:szCs w:val="20"/>
-        </w:rPr>
-        <w:t xml:space="preserve">. </w:t>
-      </w:r>
-      <w:hyperlink w:history="1" r:id="rId2k5jt92s2hg0uztkvkivv">
+        <w:t xml:space="preserve">Agentic AI: Autonomy, accountability, and the algorithmic society. (2025). </w:t>
+      </w:r>
+      <w:r>
+        <w:rPr>
+          <w:rFonts w:ascii="Times New Roman" w:cs="Times New Roman" w:eastAsia="Times New Roman" w:hAnsi="Times New Roman"/>
+          <w:i/>
+          <w:iCs/>
+          <w:sz w:val="20"/>
+          <w:szCs w:val="20"/>
+        </w:rPr>
+        <w:t xml:space="preserve"/>
+      </w:r>
+      <w:r>
+        <w:rPr>
+          <w:rFonts w:ascii="Times New Roman" w:cs="Times New Roman" w:eastAsia="Times New Roman" w:hAnsi="Times New Roman"/>
+          <w:sz w:val="20"/>
+          <w:szCs w:val="20"/>
+        </w:rPr>
+        <w:t xml:space="preserve"> [Preprint]. arXiv:2502.00289. </w:t>
+      </w:r>
+      <w:hyperlink w:history="1" r:id="rIdxwmxkd4voywto36pnjcpz">
         <w:r>
           <w:rPr>
             <w:rStyle w:val="Hyperlink"/>
             <w:rFonts w:ascii="Times New Roman" w:cs="Times New Roman" w:eastAsia="Times New Roman" w:hAnsi="Times New Roman"/>
           </w:rPr>
-          <w:t xml:space="preserve">https://www.pnas.org/doi/10.1073/pnas.2422633122</w:t>
+          <w:t xml:space="preserve">https://arxiv.org/abs/2502.00289</w:t>
         </w:r>
       </w:hyperlink>
     </w:p>
@@ -2878,33 +2891,33 @@
           <w:sz w:val="20"/>
           <w:szCs w:val="20"/>
         </w:rPr>
-        <w:t xml:space="preserve">European Union. (2024). </w:t>
-      </w:r>
-      <w:r>
-        <w:rPr>
-          <w:rFonts w:ascii="Times New Roman" w:cs="Times New Roman" w:eastAsia="Times New Roman" w:hAnsi="Times New Roman"/>
-          <w:i/>
-          <w:iCs/>
-          <w:sz w:val="20"/>
-          <w:szCs w:val="20"/>
-        </w:rPr>
-        <w:t xml:space="preserve">Regulation (EU) 2024/1689 (Artificial Intelligence Act), Article 5 and Annex III</w:t>
-      </w:r>
-      <w:r>
-        <w:rPr>
-          <w:rFonts w:ascii="Times New Roman" w:cs="Times New Roman" w:eastAsia="Times New Roman" w:hAnsi="Times New Roman"/>
-          <w:sz w:val="20"/>
-          <w:szCs w:val="20"/>
-        </w:rPr>
-        <w:t xml:space="preserve">. </w:t>
-      </w:r>
-      <w:hyperlink w:history="1" r:id="rIdxwqmfxhhyq_lrmzls8e6c">
+        <w:t xml:space="preserve">Alqurni, J. (2026). Exploring the role of agentic AI in fostering self-efficacy, autonomy support, and self-learning motivation in higher education. </w:t>
+      </w:r>
+      <w:r>
+        <w:rPr>
+          <w:rFonts w:ascii="Times New Roman" w:cs="Times New Roman" w:eastAsia="Times New Roman" w:hAnsi="Times New Roman"/>
+          <w:i/>
+          <w:iCs/>
+          <w:sz w:val="20"/>
+          <w:szCs w:val="20"/>
+        </w:rPr>
+        <w:t xml:space="preserve">Frontiers in Artificial Intelligence, 9</w:t>
+      </w:r>
+      <w:r>
+        <w:rPr>
+          <w:rFonts w:ascii="Times New Roman" w:cs="Times New Roman" w:eastAsia="Times New Roman" w:hAnsi="Times New Roman"/>
+          <w:sz w:val="20"/>
+          <w:szCs w:val="20"/>
+        </w:rPr>
+        <w:t xml:space="preserve">, Article 1738774. </w:t>
+      </w:r>
+      <w:hyperlink w:history="1" r:id="rIdgdcqdyh4skp0ppkk0k6nc">
         <w:r>
           <w:rPr>
             <w:rStyle w:val="Hyperlink"/>
             <w:rFonts w:ascii="Times New Roman" w:cs="Times New Roman" w:eastAsia="Times New Roman" w:hAnsi="Times New Roman"/>
           </w:rPr>
-          <w:t xml:space="preserve">https://artificialintelligenceact.eu/article/5/</w:t>
+          <w:t xml:space="preserve">https://doi.org/10.3389/frai.2026.1738774</w:t>
         </w:r>
       </w:hyperlink>
     </w:p>
@@ -2920,33 +2933,33 @@
           <w:sz w:val="20"/>
           <w:szCs w:val="20"/>
         </w:rPr>
-        <w:t xml:space="preserve">Fan, Y., et al. (2025). Beware of metacognitive laziness: Effects of generative artificial intelligence on learning motivation, processes, and performance. </w:t>
-      </w:r>
-      <w:r>
-        <w:rPr>
-          <w:rFonts w:ascii="Times New Roman" w:cs="Times New Roman" w:eastAsia="Times New Roman" w:hAnsi="Times New Roman"/>
-          <w:i/>
-          <w:iCs/>
-          <w:sz w:val="20"/>
-          <w:szCs w:val="20"/>
-        </w:rPr>
-        <w:t xml:space="preserve">British Journal of Educational Technology</w:t>
-      </w:r>
-      <w:r>
-        <w:rPr>
-          <w:rFonts w:ascii="Times New Roman" w:cs="Times New Roman" w:eastAsia="Times New Roman" w:hAnsi="Times New Roman"/>
-          <w:sz w:val="20"/>
-          <w:szCs w:val="20"/>
-        </w:rPr>
-        <w:t xml:space="preserve">. </w:t>
-      </w:r>
-      <w:hyperlink w:history="1" r:id="rId8spcjhac7-2mvaor4ot2l">
+        <w:t xml:space="preserve">Bastani, H., Bastani, O., Sungu, A., Ge, H., Kabakcı, Ö., &amp; Mariman, R. (2025). Generative AI without guardrails can harm learning: Evidence from high school mathematics. </w:t>
+      </w:r>
+      <w:r>
+        <w:rPr>
+          <w:rFonts w:ascii="Times New Roman" w:cs="Times New Roman" w:eastAsia="Times New Roman" w:hAnsi="Times New Roman"/>
+          <w:i/>
+          <w:iCs/>
+          <w:sz w:val="20"/>
+          <w:szCs w:val="20"/>
+        </w:rPr>
+        <w:t xml:space="preserve">Proceedings of the National Academy of Sciences, 122</w:t>
+      </w:r>
+      <w:r>
+        <w:rPr>
+          <w:rFonts w:ascii="Times New Roman" w:cs="Times New Roman" w:eastAsia="Times New Roman" w:hAnsi="Times New Roman"/>
+          <w:sz w:val="20"/>
+          <w:szCs w:val="20"/>
+        </w:rPr>
+        <w:t xml:space="preserve">(26), e2422633122. </w:t>
+      </w:r>
+      <w:hyperlink w:history="1" r:id="rId_8zphpjr7gm6e5kynsap3">
         <w:r>
           <w:rPr>
             <w:rStyle w:val="Hyperlink"/>
             <w:rFonts w:ascii="Times New Roman" w:cs="Times New Roman" w:eastAsia="Times New Roman" w:hAnsi="Times New Roman"/>
           </w:rPr>
-          <w:t xml:space="preserve">https://arxiv.org/abs/2412.09315</w:t>
+          <w:t xml:space="preserve">https://doi.org/10.1073/pnas.2422633122</w:t>
         </w:r>
       </w:hyperlink>
     </w:p>
@@ -2962,6 +2975,258 @@
           <w:sz w:val="20"/>
           <w:szCs w:val="20"/>
         </w:rPr>
+        <w:t xml:space="preserve">Bittle, K., &amp; El-Gayar, O. (2025). Generative AI and academic integrity in higher education: A systematic review and research agenda. </w:t>
+      </w:r>
+      <w:r>
+        <w:rPr>
+          <w:rFonts w:ascii="Times New Roman" w:cs="Times New Roman" w:eastAsia="Times New Roman" w:hAnsi="Times New Roman"/>
+          <w:i/>
+          <w:iCs/>
+          <w:sz w:val="20"/>
+          <w:szCs w:val="20"/>
+        </w:rPr>
+        <w:t xml:space="preserve">Information, 16</w:t>
+      </w:r>
+      <w:r>
+        <w:rPr>
+          <w:rFonts w:ascii="Times New Roman" w:cs="Times New Roman" w:eastAsia="Times New Roman" w:hAnsi="Times New Roman"/>
+          <w:sz w:val="20"/>
+          <w:szCs w:val="20"/>
+        </w:rPr>
+        <w:t xml:space="preserve">(4), Article 296. </w:t>
+      </w:r>
+      <w:hyperlink w:history="1" r:id="rId2ihpokzkv3zz277izpt4y">
+        <w:r>
+          <w:rPr>
+            <w:rStyle w:val="Hyperlink"/>
+            <w:rFonts w:ascii="Times New Roman" w:cs="Times New Roman" w:eastAsia="Times New Roman" w:hAnsi="Times New Roman"/>
+          </w:rPr>
+          <w:t xml:space="preserve">https://doi.org/10.3390/info16040296</w:t>
+        </w:r>
+      </w:hyperlink>
+    </w:p>
+    <w:p>
+      <w:pPr>
+        <w:spacing w:after="100" w:line="300"/>
+        <w:ind w:left="720" w:hanging="720"/>
+        <w:jc w:val="left"/>
+      </w:pPr>
+      <w:r>
+        <w:rPr>
+          <w:rFonts w:ascii="Times New Roman" w:cs="Times New Roman" w:eastAsia="Times New Roman" w:hAnsi="Times New Roman"/>
+          <w:sz w:val="20"/>
+          <w:szCs w:val="20"/>
+        </w:rPr>
+        <w:t xml:space="preserve">Cheng, L., Shi, H., Wu, Y., &amp; Li, F. (2026). Do generative AI-powered pedagogical agents improve learners’ academic performance effectively? Evidence from meta-analysis. </w:t>
+      </w:r>
+      <w:r>
+        <w:rPr>
+          <w:rFonts w:ascii="Times New Roman" w:cs="Times New Roman" w:eastAsia="Times New Roman" w:hAnsi="Times New Roman"/>
+          <w:i/>
+          <w:iCs/>
+          <w:sz w:val="20"/>
+          <w:szCs w:val="20"/>
+        </w:rPr>
+        <w:t xml:space="preserve">Journal of Educational Computing Research</w:t>
+      </w:r>
+      <w:r>
+        <w:rPr>
+          <w:rFonts w:ascii="Times New Roman" w:cs="Times New Roman" w:eastAsia="Times New Roman" w:hAnsi="Times New Roman"/>
+          <w:sz w:val="20"/>
+          <w:szCs w:val="20"/>
+        </w:rPr>
+        <w:t xml:space="preserve">. Advance online publication. </w:t>
+      </w:r>
+      <w:hyperlink w:history="1" r:id="rId32vrc7j_fmthtiegdpow1">
+        <w:r>
+          <w:rPr>
+            <w:rStyle w:val="Hyperlink"/>
+            <w:rFonts w:ascii="Times New Roman" w:cs="Times New Roman" w:eastAsia="Times New Roman" w:hAnsi="Times New Roman"/>
+          </w:rPr>
+          <w:t xml:space="preserve">https://doi.org/10.1177/07356331251400540</w:t>
+        </w:r>
+      </w:hyperlink>
+    </w:p>
+    <w:p>
+      <w:pPr>
+        <w:spacing w:after="100" w:line="300"/>
+        <w:ind w:left="720" w:hanging="720"/>
+        <w:jc w:val="left"/>
+      </w:pPr>
+      <w:r>
+        <w:rPr>
+          <w:rFonts w:ascii="Times New Roman" w:cs="Times New Roman" w:eastAsia="Times New Roman" w:hAnsi="Times New Roman"/>
+          <w:sz w:val="20"/>
+          <w:szCs w:val="20"/>
+        </w:rPr>
+        <w:t xml:space="preserve">Chu, Z., Wang, S., Xie, J., Zhu, T., Yan, Y., Ye, J., Zhong, A., Hu, X., Liang, J., Yu, P. S., &amp; Wen, Q. (2025). LLM agents for education: Advances and applications. In </w:t>
+      </w:r>
+      <w:r>
+        <w:rPr>
+          <w:rFonts w:ascii="Times New Roman" w:cs="Times New Roman" w:eastAsia="Times New Roman" w:hAnsi="Times New Roman"/>
+          <w:i/>
+          <w:iCs/>
+          <w:sz w:val="20"/>
+          <w:szCs w:val="20"/>
+        </w:rPr>
+        <w:t xml:space="preserve">Findings of the Association for Computational Linguistics: EMNLP 2025</w:t>
+      </w:r>
+      <w:r>
+        <w:rPr>
+          <w:rFonts w:ascii="Times New Roman" w:cs="Times New Roman" w:eastAsia="Times New Roman" w:hAnsi="Times New Roman"/>
+          <w:sz w:val="20"/>
+          <w:szCs w:val="20"/>
+        </w:rPr>
+        <w:t xml:space="preserve"> (pp. 13782–13810). Association for Computational Linguistics. </w:t>
+      </w:r>
+      <w:hyperlink w:history="1" r:id="rIdruqcb588oapehj7m1mbwj">
+        <w:r>
+          <w:rPr>
+            <w:rStyle w:val="Hyperlink"/>
+            <w:rFonts w:ascii="Times New Roman" w:cs="Times New Roman" w:eastAsia="Times New Roman" w:hAnsi="Times New Roman"/>
+          </w:rPr>
+          <w:t xml:space="preserve">https://aclanthology.org/2025.findings-emnlp.743/</w:t>
+        </w:r>
+      </w:hyperlink>
+    </w:p>
+    <w:p>
+      <w:pPr>
+        <w:spacing w:after="100" w:line="300"/>
+        <w:ind w:left="720" w:hanging="720"/>
+        <w:jc w:val="left"/>
+      </w:pPr>
+      <w:r>
+        <w:rPr>
+          <w:rFonts w:ascii="Times New Roman" w:cs="Times New Roman" w:eastAsia="Times New Roman" w:hAnsi="Times New Roman"/>
+          <w:sz w:val="20"/>
+          <w:szCs w:val="20"/>
+        </w:rPr>
+        <w:t xml:space="preserve">De Simone, M. E., Tiberti, F., Mosuro, W., Manolio, F., Barron, M., &amp; Dikoru, E. (2025). </w:t>
+      </w:r>
+      <w:r>
+        <w:rPr>
+          <w:rFonts w:ascii="Times New Roman" w:cs="Times New Roman" w:eastAsia="Times New Roman" w:hAnsi="Times New Roman"/>
+          <w:i/>
+          <w:iCs/>
+          <w:sz w:val="20"/>
+          <w:szCs w:val="20"/>
+        </w:rPr>
+        <w:t xml:space="preserve">From chalkboards to chatbots: Evaluating the impact of generative AI on learning outcomes in Nigeria</w:t>
+      </w:r>
+      <w:r>
+        <w:rPr>
+          <w:rFonts w:ascii="Times New Roman" w:cs="Times New Roman" w:eastAsia="Times New Roman" w:hAnsi="Times New Roman"/>
+          <w:sz w:val="20"/>
+          <w:szCs w:val="20"/>
+        </w:rPr>
+        <w:t xml:space="preserve"> (Policy Research Working Paper No. 11125). World Bank. </w:t>
+      </w:r>
+      <w:hyperlink w:history="1" r:id="rId7klpf_mzgc4kxi_zhawhu">
+        <w:r>
+          <w:rPr>
+            <w:rStyle w:val="Hyperlink"/>
+            <w:rFonts w:ascii="Times New Roman" w:cs="Times New Roman" w:eastAsia="Times New Roman" w:hAnsi="Times New Roman"/>
+          </w:rPr>
+          <w:t xml:space="preserve">https://documents.worldbank.org/en/publication/documents-reports/documentdetail/099548105192529324</w:t>
+        </w:r>
+      </w:hyperlink>
+    </w:p>
+    <w:p>
+      <w:pPr>
+        <w:spacing w:after="100" w:line="300"/>
+        <w:ind w:left="720" w:hanging="720"/>
+        <w:jc w:val="left"/>
+      </w:pPr>
+      <w:r>
+        <w:rPr>
+          <w:rFonts w:ascii="Times New Roman" w:cs="Times New Roman" w:eastAsia="Times New Roman" w:hAnsi="Times New Roman"/>
+          <w:sz w:val="20"/>
+          <w:szCs w:val="20"/>
+        </w:rPr>
+        <w:t xml:space="preserve">European Parliament &amp; Council of the European Union. (2024). </w:t>
+      </w:r>
+      <w:r>
+        <w:rPr>
+          <w:rFonts w:ascii="Times New Roman" w:cs="Times New Roman" w:eastAsia="Times New Roman" w:hAnsi="Times New Roman"/>
+          <w:i/>
+          <w:iCs/>
+          <w:sz w:val="20"/>
+          <w:szCs w:val="20"/>
+        </w:rPr>
+        <w:t xml:space="preserve">Regulation (EU) 2024/1689 laying down harmonised rules on artificial intelligence (Artificial Intelligence Act)</w:t>
+      </w:r>
+      <w:r>
+        <w:rPr>
+          <w:rFonts w:ascii="Times New Roman" w:cs="Times New Roman" w:eastAsia="Times New Roman" w:hAnsi="Times New Roman"/>
+          <w:sz w:val="20"/>
+          <w:szCs w:val="20"/>
+        </w:rPr>
+        <w:t xml:space="preserve">. Official Journal of the European Union, L 2024/1689. </w:t>
+      </w:r>
+      <w:hyperlink w:history="1" r:id="rIdrun7zts-hm3i0pl3tniaj">
+        <w:r>
+          <w:rPr>
+            <w:rStyle w:val="Hyperlink"/>
+            <w:rFonts w:ascii="Times New Roman" w:cs="Times New Roman" w:eastAsia="Times New Roman" w:hAnsi="Times New Roman"/>
+          </w:rPr>
+          <w:t xml:space="preserve">http://data.europa.eu/eli/reg/2024/1689/oj</w:t>
+        </w:r>
+      </w:hyperlink>
+    </w:p>
+    <w:p>
+      <w:pPr>
+        <w:spacing w:after="100" w:line="300"/>
+        <w:ind w:left="720" w:hanging="720"/>
+        <w:jc w:val="left"/>
+      </w:pPr>
+      <w:r>
+        <w:rPr>
+          <w:rFonts w:ascii="Times New Roman" w:cs="Times New Roman" w:eastAsia="Times New Roman" w:hAnsi="Times New Roman"/>
+          <w:sz w:val="20"/>
+          <w:szCs w:val="20"/>
+        </w:rPr>
+        <w:t xml:space="preserve">Fan, Y., Tang, L., Le, H., Shen, K., Tan, S., Zhao, Y., Shen, Y., Li, X., &amp; Gašević, D. (2025). Beware of metacognitive laziness: Effects of generative artificial intelligence on learning motivation, processes, and performance. </w:t>
+      </w:r>
+      <w:r>
+        <w:rPr>
+          <w:rFonts w:ascii="Times New Roman" w:cs="Times New Roman" w:eastAsia="Times New Roman" w:hAnsi="Times New Roman"/>
+          <w:i/>
+          <w:iCs/>
+          <w:sz w:val="20"/>
+          <w:szCs w:val="20"/>
+        </w:rPr>
+        <w:t xml:space="preserve">British Journal of Educational Technology, 56</w:t>
+      </w:r>
+      <w:r>
+        <w:rPr>
+          <w:rFonts w:ascii="Times New Roman" w:cs="Times New Roman" w:eastAsia="Times New Roman" w:hAnsi="Times New Roman"/>
+          <w:sz w:val="20"/>
+          <w:szCs w:val="20"/>
+        </w:rPr>
+        <w:t xml:space="preserve">(2), 489–530. </w:t>
+      </w:r>
+      <w:hyperlink w:history="1" r:id="rId09eios7tnonhioct9vcde">
+        <w:r>
+          <w:rPr>
+            <w:rStyle w:val="Hyperlink"/>
+            <w:rFonts w:ascii="Times New Roman" w:cs="Times New Roman" w:eastAsia="Times New Roman" w:hAnsi="Times New Roman"/>
+          </w:rPr>
+          <w:t xml:space="preserve">https://doi.org/10.1111/bjet.13544</w:t>
+        </w:r>
+      </w:hyperlink>
+    </w:p>
+    <w:p>
+      <w:pPr>
+        <w:spacing w:after="100" w:line="300"/>
+        <w:ind w:left="720" w:hanging="720"/>
+        <w:jc w:val="left"/>
+      </w:pPr>
+      <w:r>
+        <w:rPr>
+          <w:rFonts w:ascii="Times New Roman" w:cs="Times New Roman" w:eastAsia="Times New Roman" w:hAnsi="Times New Roman"/>
+          <w:sz w:val="20"/>
+          <w:szCs w:val="20"/>
+        </w:rPr>
         <w:t xml:space="preserve">Georgia Institute of Technology. (2025, September 2). </w:t>
       </w:r>
       <w:r>
@@ -2982,7 +3247,7 @@
         </w:rPr>
         <w:t xml:space="preserve">. Georgia Tech Research News. </w:t>
       </w:r>
-      <w:hyperlink w:history="1" r:id="rIdbtgey1l5_r8f6usc4ob3p">
+      <w:hyperlink w:history="1" r:id="rIddsvb77btak-ug2f8a3fqg">
         <w:r>
           <w:rPr>
             <w:rStyle w:val="Hyperlink"/>
@@ -3004,7 +3269,91 @@
           <w:sz w:val="20"/>
           <w:szCs w:val="20"/>
         </w:rPr>
-        <w:t xml:space="preserve">Kamalov, F., Calonge, D. S., et al. (2025). </w:t>
+        <w:t xml:space="preserve">Guan, X., Zheng, M., Gašević, D., Guo, W., Liu, Y., Han, X., Ma, R., Wu, Q., &amp; Yan, L. (2026). </w:t>
+      </w:r>
+      <w:r>
+        <w:rPr>
+          <w:rFonts w:ascii="Times New Roman" w:cs="Times New Roman" w:eastAsia="Times New Roman" w:hAnsi="Times New Roman"/>
+          <w:i/>
+          <w:iCs/>
+          <w:sz w:val="20"/>
+          <w:szCs w:val="20"/>
+        </w:rPr>
+        <w:t xml:space="preserve">From school AI readiness to student AI literacy: A national multilevel mediation analysis of institutional capacity and teacher capability</w:t>
+      </w:r>
+      <w:r>
+        <w:rPr>
+          <w:rFonts w:ascii="Times New Roman" w:cs="Times New Roman" w:eastAsia="Times New Roman" w:hAnsi="Times New Roman"/>
+          <w:sz w:val="20"/>
+          <w:szCs w:val="20"/>
+        </w:rPr>
+        <w:t xml:space="preserve"> [Preprint]. arXiv:2603.20056. </w:t>
+      </w:r>
+      <w:hyperlink w:history="1" r:id="rIdxno591z2bqdvusnxtdhip">
+        <w:r>
+          <w:rPr>
+            <w:rStyle w:val="Hyperlink"/>
+            <w:rFonts w:ascii="Times New Roman" w:cs="Times New Roman" w:eastAsia="Times New Roman" w:hAnsi="Times New Roman"/>
+          </w:rPr>
+          <w:t xml:space="preserve">https://arxiv.org/abs/2603.20056</w:t>
+        </w:r>
+      </w:hyperlink>
+    </w:p>
+    <w:p>
+      <w:pPr>
+        <w:spacing w:after="100" w:line="300"/>
+        <w:ind w:left="720" w:hanging="720"/>
+        <w:jc w:val="left"/>
+      </w:pPr>
+      <w:r>
+        <w:rPr>
+          <w:rFonts w:ascii="Times New Roman" w:cs="Times New Roman" w:eastAsia="Times New Roman" w:hAnsi="Times New Roman"/>
+          <w:sz w:val="20"/>
+          <w:szCs w:val="20"/>
+        </w:rPr>
+        <w:t xml:space="preserve">Hon, K. L. (2026). Generative AI in higher education: A systematic review of its effects on learning outcomes and academic performance. </w:t>
+      </w:r>
+      <w:r>
+        <w:rPr>
+          <w:rFonts w:ascii="Times New Roman" w:cs="Times New Roman" w:eastAsia="Times New Roman" w:hAnsi="Times New Roman"/>
+          <w:i/>
+          <w:iCs/>
+          <w:sz w:val="20"/>
+          <w:szCs w:val="20"/>
+        </w:rPr>
+        <w:t xml:space="preserve">Journal of Educational Technology Systems</w:t>
+      </w:r>
+      <w:r>
+        <w:rPr>
+          <w:rFonts w:ascii="Times New Roman" w:cs="Times New Roman" w:eastAsia="Times New Roman" w:hAnsi="Times New Roman"/>
+          <w:sz w:val="20"/>
+          <w:szCs w:val="20"/>
+        </w:rPr>
+        <w:t xml:space="preserve">. Advance online publication. </w:t>
+      </w:r>
+      <w:hyperlink w:history="1" r:id="rIdbruyjzrwmckqu0mtpty7j">
+        <w:r>
+          <w:rPr>
+            <w:rStyle w:val="Hyperlink"/>
+            <w:rFonts w:ascii="Times New Roman" w:cs="Times New Roman" w:eastAsia="Times New Roman" w:hAnsi="Times New Roman"/>
+          </w:rPr>
+          <w:t xml:space="preserve">https://doi.org/10.1177/00472395251400089</w:t>
+        </w:r>
+      </w:hyperlink>
+    </w:p>
+    <w:p>
+      <w:pPr>
+        <w:spacing w:after="100" w:line="300"/>
+        <w:ind w:left="720" w:hanging="720"/>
+        <w:jc w:val="left"/>
+      </w:pPr>
+      <w:r>
+        <w:rPr>
+          <w:rFonts w:ascii="Times New Roman" w:cs="Times New Roman" w:eastAsia="Times New Roman" w:hAnsi="Times New Roman"/>
+          <w:sz w:val="20"/>
+          <w:szCs w:val="20"/>
+        </w:rPr>
+        <w:t xml:space="preserve">Kamalov, F., Santandreu Calonge, D., Smail, L., Azizov, D., Thadani, D. R., Kwong, T., &amp; Atif, A. (2025). </w:t>
       </w:r>
       <w:r>
         <w:rPr>
@@ -3022,9 +3371,9 @@
           <w:sz w:val="20"/>
           <w:szCs w:val="20"/>
         </w:rPr>
-        <w:t xml:space="preserve"> (arXiv:2504.20082). arXiv. </w:t>
-      </w:r>
-      <w:hyperlink w:history="1" r:id="rIdytqkseyx9hihhpfxjmohg">
+        <w:t xml:space="preserve"> [Preprint]. arXiv:2504.20082. </w:t>
+      </w:r>
+      <w:hyperlink w:history="1" r:id="rId6pr4721_rnobdqe7bc1zj">
         <w:r>
           <w:rPr>
             <w:rStyle w:val="Hyperlink"/>
@@ -3046,33 +3395,33 @@
           <w:sz w:val="20"/>
           <w:szCs w:val="20"/>
         </w:rPr>
-        <w:t xml:space="preserve">Kestin, G., et al. (2025). AI tutoring outperforms in-class active learning: A randomized controlled trial. </w:t>
-      </w:r>
-      <w:r>
-        <w:rPr>
-          <w:rFonts w:ascii="Times New Roman" w:cs="Times New Roman" w:eastAsia="Times New Roman" w:hAnsi="Times New Roman"/>
-          <w:i/>
-          <w:iCs/>
-          <w:sz w:val="20"/>
-          <w:szCs w:val="20"/>
-        </w:rPr>
-        <w:t xml:space="preserve">Scientific Reports</w:t>
-      </w:r>
-      <w:r>
-        <w:rPr>
-          <w:rFonts w:ascii="Times New Roman" w:cs="Times New Roman" w:eastAsia="Times New Roman" w:hAnsi="Times New Roman"/>
-          <w:sz w:val="20"/>
-          <w:szCs w:val="20"/>
-        </w:rPr>
-        <w:t xml:space="preserve">. </w:t>
-      </w:r>
-      <w:hyperlink w:history="1" r:id="rIdgkraib0puk5nu9lxbe-mx">
+        <w:t xml:space="preserve">Kestin, G., Miller, K., Klales, A., Milbourne, T., &amp; Ponti, G. (2025). AI tutoring outperforms in-class active learning: An RCT introducing a novel research-based design in an authentic educational setting. </w:t>
+      </w:r>
+      <w:r>
+        <w:rPr>
+          <w:rFonts w:ascii="Times New Roman" w:cs="Times New Roman" w:eastAsia="Times New Roman" w:hAnsi="Times New Roman"/>
+          <w:i/>
+          <w:iCs/>
+          <w:sz w:val="20"/>
+          <w:szCs w:val="20"/>
+        </w:rPr>
+        <w:t xml:space="preserve">Scientific Reports, 15</w:t>
+      </w:r>
+      <w:r>
+        <w:rPr>
+          <w:rFonts w:ascii="Times New Roman" w:cs="Times New Roman" w:eastAsia="Times New Roman" w:hAnsi="Times New Roman"/>
+          <w:sz w:val="20"/>
+          <w:szCs w:val="20"/>
+        </w:rPr>
+        <w:t xml:space="preserve">, Article 17458. </w:t>
+      </w:r>
+      <w:hyperlink w:history="1" r:id="rIdusrvcnmqhhyelgk1ctswr">
         <w:r>
           <w:rPr>
             <w:rStyle w:val="Hyperlink"/>
             <w:rFonts w:ascii="Times New Roman" w:cs="Times New Roman" w:eastAsia="Times New Roman" w:hAnsi="Times New Roman"/>
           </w:rPr>
-          <w:t xml:space="preserve">https://www.nature.com/articles/s41598-025-97652-6</w:t>
+          <w:t xml:space="preserve">https://doi.org/10.1038/s41598-025-97652-6</w:t>
         </w:r>
       </w:hyperlink>
     </w:p>
@@ -3088,33 +3437,33 @@
           <w:sz w:val="20"/>
           <w:szCs w:val="20"/>
         </w:rPr>
-        <w:t xml:space="preserve">Kosmyna, N., et al. (2025). </w:t>
-      </w:r>
-      <w:r>
-        <w:rPr>
-          <w:rFonts w:ascii="Times New Roman" w:cs="Times New Roman" w:eastAsia="Times New Roman" w:hAnsi="Times New Roman"/>
-          <w:i/>
-          <w:iCs/>
-          <w:sz w:val="20"/>
-          <w:szCs w:val="20"/>
-        </w:rPr>
-        <w:t xml:space="preserve">Your brain on ChatGPT: Accumulation of cognitive debt when using an AI assistant for essay writing</w:t>
-      </w:r>
-      <w:r>
-        <w:rPr>
-          <w:rFonts w:ascii="Times New Roman" w:cs="Times New Roman" w:eastAsia="Times New Roman" w:hAnsi="Times New Roman"/>
-          <w:sz w:val="20"/>
-          <w:szCs w:val="20"/>
-        </w:rPr>
-        <w:t xml:space="preserve"> (arXiv:2506.08872). arXiv. </w:t>
-      </w:r>
-      <w:hyperlink w:history="1" r:id="rId84lhq1ekg28fkeomvb8ty">
+        <w:t xml:space="preserve">Kosmyna, N., Hauptmann, E., Yuan, Y. T., Situ, J., Liao, X.-H., Beresnitzky, A. V., Braunstein, I., &amp; Maes, P. (2025). </w:t>
+      </w:r>
+      <w:r>
+        <w:rPr>
+          <w:rFonts w:ascii="Times New Roman" w:cs="Times New Roman" w:eastAsia="Times New Roman" w:hAnsi="Times New Roman"/>
+          <w:i/>
+          <w:iCs/>
+          <w:sz w:val="20"/>
+          <w:szCs w:val="20"/>
+        </w:rPr>
+        <w:t xml:space="preserve">Your brain on ChatGPT: Accumulation of cognitive debt when using an AI assistant for essay writing task</w:t>
+      </w:r>
+      <w:r>
+        <w:rPr>
+          <w:rFonts w:ascii="Times New Roman" w:cs="Times New Roman" w:eastAsia="Times New Roman" w:hAnsi="Times New Roman"/>
+          <w:sz w:val="20"/>
+          <w:szCs w:val="20"/>
+        </w:rPr>
+        <w:t xml:space="preserve"> [Preprint]. arXiv:2506.08872. </w:t>
+      </w:r>
+      <w:hyperlink w:history="1" r:id="rId8xtpoyijmvj8pvawav4yo">
         <w:r>
           <w:rPr>
             <w:rStyle w:val="Hyperlink"/>
             <w:rFonts w:ascii="Times New Roman" w:cs="Times New Roman" w:eastAsia="Times New Roman" w:hAnsi="Times New Roman"/>
           </w:rPr>
-          <w:t xml:space="preserve">https://arxiv.org/abs/2506.08872</w:t>
+          <w:t xml:space="preserve">https://doi.org/10.48550/arXiv.2506.08872</w:t>
         </w:r>
       </w:hyperlink>
     </w:p>
@@ -3130,33 +3479,33 @@
           <w:sz w:val="20"/>
           <w:szCs w:val="20"/>
         </w:rPr>
-        <w:t xml:space="preserve">Liu, M., et al. (2025). The impact of ChatGPT on students’ academic achievement: A meta-analysis. </w:t>
-      </w:r>
-      <w:r>
-        <w:rPr>
-          <w:rFonts w:ascii="Times New Roman" w:cs="Times New Roman" w:eastAsia="Times New Roman" w:hAnsi="Times New Roman"/>
-          <w:i/>
-          <w:iCs/>
-          <w:sz w:val="20"/>
-          <w:szCs w:val="20"/>
-        </w:rPr>
-        <w:t xml:space="preserve">Journal of Computer Assisted Learning</w:t>
-      </w:r>
-      <w:r>
-        <w:rPr>
-          <w:rFonts w:ascii="Times New Roman" w:cs="Times New Roman" w:eastAsia="Times New Roman" w:hAnsi="Times New Roman"/>
-          <w:sz w:val="20"/>
-          <w:szCs w:val="20"/>
-        </w:rPr>
-        <w:t xml:space="preserve">. </w:t>
-      </w:r>
-      <w:hyperlink w:history="1" r:id="rIdvjsweii4rsyw3ajfzoy9s">
+        <w:t xml:space="preserve">Levels of autonomy for AI agents. (2025). </w:t>
+      </w:r>
+      <w:r>
+        <w:rPr>
+          <w:rFonts w:ascii="Times New Roman" w:cs="Times New Roman" w:eastAsia="Times New Roman" w:hAnsi="Times New Roman"/>
+          <w:i/>
+          <w:iCs/>
+          <w:sz w:val="20"/>
+          <w:szCs w:val="20"/>
+        </w:rPr>
+        <w:t xml:space="preserve"/>
+      </w:r>
+      <w:r>
+        <w:rPr>
+          <w:rFonts w:ascii="Times New Roman" w:cs="Times New Roman" w:eastAsia="Times New Roman" w:hAnsi="Times New Roman"/>
+          <w:sz w:val="20"/>
+          <w:szCs w:val="20"/>
+        </w:rPr>
+        <w:t xml:space="preserve"> [Preprint]. arXiv:2506.12469. </w:t>
+      </w:r>
+      <w:hyperlink w:history="1" r:id="rIdl5wc97w5t9c1649ei5bem">
         <w:r>
           <w:rPr>
             <w:rStyle w:val="Hyperlink"/>
             <w:rFonts w:ascii="Times New Roman" w:cs="Times New Roman" w:eastAsia="Times New Roman" w:hAnsi="Times New Roman"/>
           </w:rPr>
-          <w:t xml:space="preserve">https://onlinelibrary.wiley.com/doi/10.1111/jcal.70096</w:t>
+          <w:t xml:space="preserve">https://arxiv.org/abs/2506.12469</w:t>
         </w:r>
       </w:hyperlink>
     </w:p>
@@ -3172,33 +3521,33 @@
           <w:sz w:val="20"/>
           <w:szCs w:val="20"/>
         </w:rPr>
-        <w:t xml:space="preserve">Liu, Y., et al. (2025). </w:t>
-      </w:r>
-      <w:r>
-        <w:rPr>
-          <w:rFonts w:ascii="Times New Roman" w:cs="Times New Roman" w:eastAsia="Times New Roman" w:hAnsi="Times New Roman"/>
-          <w:i/>
-          <w:iCs/>
-          <w:sz w:val="20"/>
-          <w:szCs w:val="20"/>
-        </w:rPr>
-        <w:t xml:space="preserve">AI patient: Simulated patient systems powered by large language model-based AI agents</w:t>
-      </w:r>
-      <w:r>
-        <w:rPr>
-          <w:rFonts w:ascii="Times New Roman" w:cs="Times New Roman" w:eastAsia="Times New Roman" w:hAnsi="Times New Roman"/>
-          <w:sz w:val="20"/>
-          <w:szCs w:val="20"/>
-        </w:rPr>
-        <w:t xml:space="preserve">. Communications Medicine. </w:t>
-      </w:r>
-      <w:hyperlink w:history="1" r:id="rIdxtkrhy6jrrxnzygpoffet">
+        <w:t xml:space="preserve">Liu, X., et al. (2026). </w:t>
+      </w:r>
+      <w:r>
+        <w:rPr>
+          <w:rFonts w:ascii="Times New Roman" w:cs="Times New Roman" w:eastAsia="Times New Roman" w:hAnsi="Times New Roman"/>
+          <w:i/>
+          <w:iCs/>
+          <w:sz w:val="20"/>
+          <w:szCs w:val="20"/>
+        </w:rPr>
+        <w:t xml:space="preserve">AgentHallu: Benchmarking automated hallucination attribution of LLM-based agents</w:t>
+      </w:r>
+      <w:r>
+        <w:rPr>
+          <w:rFonts w:ascii="Times New Roman" w:cs="Times New Roman" w:eastAsia="Times New Roman" w:hAnsi="Times New Roman"/>
+          <w:sz w:val="20"/>
+          <w:szCs w:val="20"/>
+        </w:rPr>
+        <w:t xml:space="preserve"> [Preprint]. arXiv:2601.06818. </w:t>
+      </w:r>
+      <w:hyperlink w:history="1" r:id="rIdplnb_8wtjdppjnrfvkaml">
         <w:r>
           <w:rPr>
             <w:rStyle w:val="Hyperlink"/>
             <w:rFonts w:ascii="Times New Roman" w:cs="Times New Roman" w:eastAsia="Times New Roman" w:hAnsi="Times New Roman"/>
           </w:rPr>
-          <w:t xml:space="preserve">https://www.nature.com/articles/s43856-025-01283-x</w:t>
+          <w:t xml:space="preserve">https://arxiv.org/abs/2601.06818</w:t>
         </w:r>
       </w:hyperlink>
     </w:p>
@@ -3214,33 +3563,33 @@
           <w:sz w:val="20"/>
           <w:szCs w:val="20"/>
         </w:rPr>
-        <w:t xml:space="preserve">Organisation for Economic Co-operation and Development. (2023). </w:t>
-      </w:r>
-      <w:r>
-        <w:rPr>
-          <w:rFonts w:ascii="Times New Roman" w:cs="Times New Roman" w:eastAsia="Times New Roman" w:hAnsi="Times New Roman"/>
-          <w:i/>
-          <w:iCs/>
-          <w:sz w:val="20"/>
-          <w:szCs w:val="20"/>
-        </w:rPr>
-        <w:t xml:space="preserve">OECD Digital Education Outlook 2023: Algorithmic bias—The state of the situation and policy recommendations</w:t>
-      </w:r>
-      <w:r>
-        <w:rPr>
-          <w:rFonts w:ascii="Times New Roman" w:cs="Times New Roman" w:eastAsia="Times New Roman" w:hAnsi="Times New Roman"/>
-          <w:sz w:val="20"/>
-          <w:szCs w:val="20"/>
-        </w:rPr>
-        <w:t xml:space="preserve">. OECD Publishing. </w:t>
-      </w:r>
-      <w:hyperlink w:history="1" r:id="rIdkmy43pn6mpiefwbzivcb1">
+        <w:t xml:space="preserve">Liu, Z., Zuo, H., &amp; Lu, Y. (2025). The impact of ChatGPT on students’ academic achievement: A meta-analysis. </w:t>
+      </w:r>
+      <w:r>
+        <w:rPr>
+          <w:rFonts w:ascii="Times New Roman" w:cs="Times New Roman" w:eastAsia="Times New Roman" w:hAnsi="Times New Roman"/>
+          <w:i/>
+          <w:iCs/>
+          <w:sz w:val="20"/>
+          <w:szCs w:val="20"/>
+        </w:rPr>
+        <w:t xml:space="preserve">Journal of Computer Assisted Learning, 41</w:t>
+      </w:r>
+      <w:r>
+        <w:rPr>
+          <w:rFonts w:ascii="Times New Roman" w:cs="Times New Roman" w:eastAsia="Times New Roman" w:hAnsi="Times New Roman"/>
+          <w:sz w:val="20"/>
+          <w:szCs w:val="20"/>
+        </w:rPr>
+        <w:t xml:space="preserve">(4), e70096. </w:t>
+      </w:r>
+      <w:hyperlink w:history="1" r:id="rId3vbqjy4p_gzsbifnouqxj">
         <w:r>
           <w:rPr>
             <w:rStyle w:val="Hyperlink"/>
             <w:rFonts w:ascii="Times New Roman" w:cs="Times New Roman" w:eastAsia="Times New Roman" w:hAnsi="Times New Roman"/>
           </w:rPr>
-          <w:t xml:space="preserve">https://www.oecd.org/en/publications/oecd-digital-education-outlook-2023_c74f03de-en.html</w:t>
+          <w:t xml:space="preserve">https://doi.org/10.1111/jcal.70096</w:t>
         </w:r>
       </w:hyperlink>
     </w:p>
@@ -3256,33 +3605,33 @@
           <w:sz w:val="20"/>
           <w:szCs w:val="20"/>
         </w:rPr>
-        <w:t xml:space="preserve">Retraction Note. (2026). Retraction: Meta-analysis of ChatGPT’s effects on learning. </w:t>
-      </w:r>
-      <w:r>
-        <w:rPr>
-          <w:rFonts w:ascii="Times New Roman" w:cs="Times New Roman" w:eastAsia="Times New Roman" w:hAnsi="Times New Roman"/>
-          <w:i/>
-          <w:iCs/>
-          <w:sz w:val="20"/>
-          <w:szCs w:val="20"/>
-        </w:rPr>
-        <w:t xml:space="preserve">Humanities and Social Sciences Communications</w:t>
-      </w:r>
-      <w:r>
-        <w:rPr>
-          <w:rFonts w:ascii="Times New Roman" w:cs="Times New Roman" w:eastAsia="Times New Roman" w:hAnsi="Times New Roman"/>
-          <w:sz w:val="20"/>
-          <w:szCs w:val="20"/>
-        </w:rPr>
-        <w:t xml:space="preserve">. </w:t>
-      </w:r>
-      <w:hyperlink w:history="1" r:id="rIdeppwbctpr-ovcceprnhhb">
+        <w:t xml:space="preserve">Logachev, M. (2026). Artificial intelligence in educational assignments: Issues of academic integrity. </w:t>
+      </w:r>
+      <w:r>
+        <w:rPr>
+          <w:rFonts w:ascii="Times New Roman" w:cs="Times New Roman" w:eastAsia="Times New Roman" w:hAnsi="Times New Roman"/>
+          <w:i/>
+          <w:iCs/>
+          <w:sz w:val="20"/>
+          <w:szCs w:val="20"/>
+        </w:rPr>
+        <w:t xml:space="preserve">Frontiers in Computer Science, 8</w:t>
+      </w:r>
+      <w:r>
+        <w:rPr>
+          <w:rFonts w:ascii="Times New Roman" w:cs="Times New Roman" w:eastAsia="Times New Roman" w:hAnsi="Times New Roman"/>
+          <w:sz w:val="20"/>
+          <w:szCs w:val="20"/>
+        </w:rPr>
+        <w:t xml:space="preserve">, Article 1729059. </w:t>
+      </w:r>
+      <w:hyperlink w:history="1" r:id="rIduw813kv53t7hh-sejtxkv">
         <w:r>
           <w:rPr>
             <w:rStyle w:val="Hyperlink"/>
             <w:rFonts w:ascii="Times New Roman" w:cs="Times New Roman" w:eastAsia="Times New Roman" w:hAnsi="Times New Roman"/>
           </w:rPr>
-          <w:t xml:space="preserve">https://www.nature.com/articles/s41599-026-07310-z</w:t>
+          <w:t xml:space="preserve">https://doi.org/10.3389/fcomp.2026.1729059</w:t>
         </w:r>
       </w:hyperlink>
     </w:p>
@@ -3298,33 +3647,33 @@
           <w:sz w:val="20"/>
           <w:szCs w:val="20"/>
         </w:rPr>
-        <w:t xml:space="preserve">Sapkota, R., Roumeliotis, K. I., &amp; Karkee, M. (2025). </w:t>
-      </w:r>
-      <w:r>
-        <w:rPr>
-          <w:rFonts w:ascii="Times New Roman" w:cs="Times New Roman" w:eastAsia="Times New Roman" w:hAnsi="Times New Roman"/>
-          <w:i/>
-          <w:iCs/>
-          <w:sz w:val="20"/>
-          <w:szCs w:val="20"/>
-        </w:rPr>
-        <w:t xml:space="preserve">AI agents vs. agentic AI: A conceptual taxonomy, applications and challenges</w:t>
-      </w:r>
-      <w:r>
-        <w:rPr>
-          <w:rFonts w:ascii="Times New Roman" w:cs="Times New Roman" w:eastAsia="Times New Roman" w:hAnsi="Times New Roman"/>
-          <w:sz w:val="20"/>
-          <w:szCs w:val="20"/>
-        </w:rPr>
-        <w:t xml:space="preserve"> (arXiv:2505.10468). arXiv / Information Fusion. </w:t>
-      </w:r>
-      <w:hyperlink w:history="1" r:id="rId6v-nijsiew1_rsj6e07-d">
+        <w:t xml:space="preserve">Matjie, M. A., Nethavhani, A., &amp; Matlakala, M. (2026). AI and the digital divide in education. </w:t>
+      </w:r>
+      <w:r>
+        <w:rPr>
+          <w:rFonts w:ascii="Times New Roman" w:cs="Times New Roman" w:eastAsia="Times New Roman" w:hAnsi="Times New Roman"/>
+          <w:i/>
+          <w:iCs/>
+          <w:sz w:val="20"/>
+          <w:szCs w:val="20"/>
+        </w:rPr>
+        <w:t xml:space="preserve">Frontiers in Computer Science, 8</w:t>
+      </w:r>
+      <w:r>
+        <w:rPr>
+          <w:rFonts w:ascii="Times New Roman" w:cs="Times New Roman" w:eastAsia="Times New Roman" w:hAnsi="Times New Roman"/>
+          <w:sz w:val="20"/>
+          <w:szCs w:val="20"/>
+        </w:rPr>
+        <w:t xml:space="preserve">, Article 1759027. </w:t>
+      </w:r>
+      <w:hyperlink w:history="1" r:id="rIdu16wv9puxkaon8ttu63-c">
         <w:r>
           <w:rPr>
             <w:rStyle w:val="Hyperlink"/>
             <w:rFonts w:ascii="Times New Roman" w:cs="Times New Roman" w:eastAsia="Times New Roman" w:hAnsi="Times New Roman"/>
           </w:rPr>
-          <w:t xml:space="preserve">https://arxiv.org/abs/2505.10468</w:t>
+          <w:t xml:space="preserve">https://doi.org/10.3389/fcomp.2026.1759027</w:t>
         </w:r>
       </w:hyperlink>
     </w:p>
@@ -3340,6 +3689,258 @@
           <w:sz w:val="20"/>
           <w:szCs w:val="20"/>
         </w:rPr>
+        <w:t xml:space="preserve">OECD. (2023). </w:t>
+      </w:r>
+      <w:r>
+        <w:rPr>
+          <w:rFonts w:ascii="Times New Roman" w:cs="Times New Roman" w:eastAsia="Times New Roman" w:hAnsi="Times New Roman"/>
+          <w:i/>
+          <w:iCs/>
+          <w:sz w:val="20"/>
+          <w:szCs w:val="20"/>
+        </w:rPr>
+        <w:t xml:space="preserve">OECD Digital Education Outlook 2023: Towards an effective digital education ecosystem</w:t>
+      </w:r>
+      <w:r>
+        <w:rPr>
+          <w:rFonts w:ascii="Times New Roman" w:cs="Times New Roman" w:eastAsia="Times New Roman" w:hAnsi="Times New Roman"/>
+          <w:sz w:val="20"/>
+          <w:szCs w:val="20"/>
+        </w:rPr>
+        <w:t xml:space="preserve">. OECD Publishing. </w:t>
+      </w:r>
+      <w:hyperlink w:history="1" r:id="rIdhotjylmnlvvi0xdct4paz">
+        <w:r>
+          <w:rPr>
+            <w:rStyle w:val="Hyperlink"/>
+            <w:rFonts w:ascii="Times New Roman" w:cs="Times New Roman" w:eastAsia="Times New Roman" w:hAnsi="Times New Roman"/>
+          </w:rPr>
+          <w:t xml:space="preserve">https://doi.org/10.1787/c74f03de-en</w:t>
+        </w:r>
+      </w:hyperlink>
+    </w:p>
+    <w:p>
+      <w:pPr>
+        <w:spacing w:after="100" w:line="300"/>
+        <w:ind w:left="720" w:hanging="720"/>
+        <w:jc w:val="left"/>
+      </w:pPr>
+      <w:r>
+        <w:rPr>
+          <w:rFonts w:ascii="Times New Roman" w:cs="Times New Roman" w:eastAsia="Times New Roman" w:hAnsi="Times New Roman"/>
+          <w:sz w:val="20"/>
+          <w:szCs w:val="20"/>
+        </w:rPr>
+        <w:t xml:space="preserve">OnlineMate: An LLM-based multi-agent companion system for cognitive support in online learning. (2025). </w:t>
+      </w:r>
+      <w:r>
+        <w:rPr>
+          <w:rFonts w:ascii="Times New Roman" w:cs="Times New Roman" w:eastAsia="Times New Roman" w:hAnsi="Times New Roman"/>
+          <w:i/>
+          <w:iCs/>
+          <w:sz w:val="20"/>
+          <w:szCs w:val="20"/>
+        </w:rPr>
+        <w:t xml:space="preserve"/>
+      </w:r>
+      <w:r>
+        <w:rPr>
+          <w:rFonts w:ascii="Times New Roman" w:cs="Times New Roman" w:eastAsia="Times New Roman" w:hAnsi="Times New Roman"/>
+          <w:sz w:val="20"/>
+          <w:szCs w:val="20"/>
+        </w:rPr>
+        <w:t xml:space="preserve"> [Preprint]. arXiv:2509.14803. </w:t>
+      </w:r>
+      <w:hyperlink w:history="1" r:id="rIdjrh3lugfkt7suoivluxfj">
+        <w:r>
+          <w:rPr>
+            <w:rStyle w:val="Hyperlink"/>
+            <w:rFonts w:ascii="Times New Roman" w:cs="Times New Roman" w:eastAsia="Times New Roman" w:hAnsi="Times New Roman"/>
+          </w:rPr>
+          <w:t xml:space="preserve">https://arxiv.org/abs/2509.14803</w:t>
+        </w:r>
+      </w:hyperlink>
+    </w:p>
+    <w:p>
+      <w:pPr>
+        <w:spacing w:after="100" w:line="300"/>
+        <w:ind w:left="720" w:hanging="720"/>
+        <w:jc w:val="left"/>
+      </w:pPr>
+      <w:r>
+        <w:rPr>
+          <w:rFonts w:ascii="Times New Roman" w:cs="Times New Roman" w:eastAsia="Times New Roman" w:hAnsi="Times New Roman"/>
+          <w:sz w:val="20"/>
+          <w:szCs w:val="20"/>
+        </w:rPr>
+        <w:t xml:space="preserve">Retraction note: The effect of ChatGPT on students’ learning performance, learning perception, and higher-order thinking. (2026). </w:t>
+      </w:r>
+      <w:r>
+        <w:rPr>
+          <w:rFonts w:ascii="Times New Roman" w:cs="Times New Roman" w:eastAsia="Times New Roman" w:hAnsi="Times New Roman"/>
+          <w:i/>
+          <w:iCs/>
+          <w:sz w:val="20"/>
+          <w:szCs w:val="20"/>
+        </w:rPr>
+        <w:t xml:space="preserve">Humanities and Social Sciences Communications, 13</w:t>
+      </w:r>
+      <w:r>
+        <w:rPr>
+          <w:rFonts w:ascii="Times New Roman" w:cs="Times New Roman" w:eastAsia="Times New Roman" w:hAnsi="Times New Roman"/>
+          <w:sz w:val="20"/>
+          <w:szCs w:val="20"/>
+        </w:rPr>
+        <w:t xml:space="preserve">(1). </w:t>
+      </w:r>
+      <w:hyperlink w:history="1" r:id="rIdoiusu7tywyc2thdgqikym">
+        <w:r>
+          <w:rPr>
+            <w:rStyle w:val="Hyperlink"/>
+            <w:rFonts w:ascii="Times New Roman" w:cs="Times New Roman" w:eastAsia="Times New Roman" w:hAnsi="Times New Roman"/>
+          </w:rPr>
+          <w:t xml:space="preserve">https://doi.org/10.1057/s41599-026-07310-z</w:t>
+        </w:r>
+      </w:hyperlink>
+    </w:p>
+    <w:p>
+      <w:pPr>
+        <w:spacing w:after="100" w:line="300"/>
+        <w:ind w:left="720" w:hanging="720"/>
+        <w:jc w:val="left"/>
+      </w:pPr>
+      <w:r>
+        <w:rPr>
+          <w:rFonts w:ascii="Times New Roman" w:cs="Times New Roman" w:eastAsia="Times New Roman" w:hAnsi="Times New Roman"/>
+          <w:sz w:val="20"/>
+          <w:szCs w:val="20"/>
+        </w:rPr>
+        <w:t xml:space="preserve">Sapkota, R., Roumeliotis, K. I., &amp; Karkee, M. (2025). AI agents vs. agentic AI: A conceptual taxonomy, applications and challenges. </w:t>
+      </w:r>
+      <w:r>
+        <w:rPr>
+          <w:rFonts w:ascii="Times New Roman" w:cs="Times New Roman" w:eastAsia="Times New Roman" w:hAnsi="Times New Roman"/>
+          <w:i/>
+          <w:iCs/>
+          <w:sz w:val="20"/>
+          <w:szCs w:val="20"/>
+        </w:rPr>
+        <w:t xml:space="preserve">Information Fusion, 126</w:t>
+      </w:r>
+      <w:r>
+        <w:rPr>
+          <w:rFonts w:ascii="Times New Roman" w:cs="Times New Roman" w:eastAsia="Times New Roman" w:hAnsi="Times New Roman"/>
+          <w:sz w:val="20"/>
+          <w:szCs w:val="20"/>
+        </w:rPr>
+        <w:t xml:space="preserve">, Article 103599. </w:t>
+      </w:r>
+      <w:hyperlink w:history="1" r:id="rIdnoeg_m_iafqofm1nt9qbl">
+        <w:r>
+          <w:rPr>
+            <w:rStyle w:val="Hyperlink"/>
+            <w:rFonts w:ascii="Times New Roman" w:cs="Times New Roman" w:eastAsia="Times New Roman" w:hAnsi="Times New Roman"/>
+          </w:rPr>
+          <w:t xml:space="preserve">https://doi.org/10.1016/j.inffus.2025.103599</w:t>
+        </w:r>
+      </w:hyperlink>
+    </w:p>
+    <w:p>
+      <w:pPr>
+        <w:spacing w:after="100" w:line="300"/>
+        <w:ind w:left="720" w:hanging="720"/>
+        <w:jc w:val="left"/>
+      </w:pPr>
+      <w:r>
+        <w:rPr>
+          <w:rFonts w:ascii="Times New Roman" w:cs="Times New Roman" w:eastAsia="Times New Roman" w:hAnsi="Times New Roman"/>
+          <w:sz w:val="20"/>
+          <w:szCs w:val="20"/>
+        </w:rPr>
+        <w:t xml:space="preserve">Shoufan, A., &amp; Esmaeil, A.-A. A. (2026). </w:t>
+      </w:r>
+      <w:r>
+        <w:rPr>
+          <w:rFonts w:ascii="Times New Roman" w:cs="Times New Roman" w:eastAsia="Times New Roman" w:hAnsi="Times New Roman"/>
+          <w:i/>
+          <w:iCs/>
+          <w:sz w:val="20"/>
+          <w:szCs w:val="20"/>
+        </w:rPr>
+        <w:t xml:space="preserve">AI hallucination from students’ perspective: A thematic analysis</w:t>
+      </w:r>
+      <w:r>
+        <w:rPr>
+          <w:rFonts w:ascii="Times New Roman" w:cs="Times New Roman" w:eastAsia="Times New Roman" w:hAnsi="Times New Roman"/>
+          <w:sz w:val="20"/>
+          <w:szCs w:val="20"/>
+        </w:rPr>
+        <w:t xml:space="preserve"> [Preprint]. arXiv:2602.17671. </w:t>
+      </w:r>
+      <w:hyperlink w:history="1" r:id="rId0d5lunh-t59pex6x2y3mc">
+        <w:r>
+          <w:rPr>
+            <w:rStyle w:val="Hyperlink"/>
+            <w:rFonts w:ascii="Times New Roman" w:cs="Times New Roman" w:eastAsia="Times New Roman" w:hAnsi="Times New Roman"/>
+          </w:rPr>
+          <w:t xml:space="preserve">https://arxiv.org/abs/2602.17671</w:t>
+        </w:r>
+      </w:hyperlink>
+    </w:p>
+    <w:p>
+      <w:pPr>
+        <w:spacing w:after="100" w:line="300"/>
+        <w:ind w:left="720" w:hanging="720"/>
+        <w:jc w:val="left"/>
+      </w:pPr>
+      <w:r>
+        <w:rPr>
+          <w:rFonts w:ascii="Times New Roman" w:cs="Times New Roman" w:eastAsia="Times New Roman" w:hAnsi="Times New Roman"/>
+          <w:sz w:val="20"/>
+          <w:szCs w:val="20"/>
+        </w:rPr>
+        <w:t xml:space="preserve">Slijepcevic, N., &amp; Yaylali, A. (2025). Leveraging “Khanmigo” generative AI-powered tool for personalized tutoring to learn scientific concepts. </w:t>
+      </w:r>
+      <w:r>
+        <w:rPr>
+          <w:rFonts w:ascii="Times New Roman" w:cs="Times New Roman" w:eastAsia="Times New Roman" w:hAnsi="Times New Roman"/>
+          <w:i/>
+          <w:iCs/>
+          <w:sz w:val="20"/>
+          <w:szCs w:val="20"/>
+        </w:rPr>
+        <w:t xml:space="preserve">Journal of Teaching and Learning, 19</w:t>
+      </w:r>
+      <w:r>
+        <w:rPr>
+          <w:rFonts w:ascii="Times New Roman" w:cs="Times New Roman" w:eastAsia="Times New Roman" w:hAnsi="Times New Roman"/>
+          <w:sz w:val="20"/>
+          <w:szCs w:val="20"/>
+        </w:rPr>
+        <w:t xml:space="preserve">(4), 155–178. </w:t>
+      </w:r>
+      <w:hyperlink w:history="1" r:id="rIdurvde24s19070rj3amxqc">
+        <w:r>
+          <w:rPr>
+            <w:rStyle w:val="Hyperlink"/>
+            <w:rFonts w:ascii="Times New Roman" w:cs="Times New Roman" w:eastAsia="Times New Roman" w:hAnsi="Times New Roman"/>
+          </w:rPr>
+          <w:t xml:space="preserve">https://jtl.uwindsor.ca/index.php/jtl/article/view/10052</w:t>
+        </w:r>
+      </w:hyperlink>
+    </w:p>
+    <w:p>
+      <w:pPr>
+        <w:spacing w:after="100" w:line="300"/>
+        <w:ind w:left="720" w:hanging="720"/>
+        <w:jc w:val="left"/>
+      </w:pPr>
+      <w:r>
+        <w:rPr>
+          <w:rFonts w:ascii="Times New Roman" w:cs="Times New Roman" w:eastAsia="Times New Roman" w:hAnsi="Times New Roman"/>
+          <w:sz w:val="20"/>
+          <w:szCs w:val="20"/>
+        </w:rPr>
         <w:t xml:space="preserve">Stanford SCALE Initiative. (2025). </w:t>
       </w:r>
       <w:r>
@@ -3358,9 +3959,9 @@
           <w:sz w:val="20"/>
           <w:szCs w:val="20"/>
         </w:rPr>
-        <w:t xml:space="preserve"> (arXiv:2508.16659). arXiv. </w:t>
-      </w:r>
-      <w:hyperlink w:history="1" r:id="rIddgoa2pspisyua1p5dsv8x">
+        <w:t xml:space="preserve"> [Preprint]. arXiv:2508.16659. </w:t>
+      </w:r>
+      <w:hyperlink w:history="1" r:id="rIdqcj0laiu9sp-wm4ywxawc">
         <w:r>
           <w:rPr>
             <w:rStyle w:val="Hyperlink"/>
@@ -3382,33 +3983,33 @@
           <w:sz w:val="20"/>
           <w:szCs w:val="20"/>
         </w:rPr>
-        <w:t xml:space="preserve">United Nations Educational, Scientific and Cultural Organization. (2023). </w:t>
-      </w:r>
-      <w:r>
-        <w:rPr>
-          <w:rFonts w:ascii="Times New Roman" w:cs="Times New Roman" w:eastAsia="Times New Roman" w:hAnsi="Times New Roman"/>
-          <w:i/>
-          <w:iCs/>
-          <w:sz w:val="20"/>
-          <w:szCs w:val="20"/>
-        </w:rPr>
-        <w:t xml:space="preserve">Guidance for generative AI in education and research</w:t>
-      </w:r>
-      <w:r>
-        <w:rPr>
-          <w:rFonts w:ascii="Times New Roman" w:cs="Times New Roman" w:eastAsia="Times New Roman" w:hAnsi="Times New Roman"/>
-          <w:sz w:val="20"/>
-          <w:szCs w:val="20"/>
-        </w:rPr>
-        <w:t xml:space="preserve">. UNESCO. </w:t>
-      </w:r>
-      <w:hyperlink w:history="1" r:id="rIdrawptbqbmgvmsudawuvwb">
+        <w:t xml:space="preserve">Teaching with AI: A systematic review of chatbots, generative tools, and tutoring systems in programming education. (2025). </w:t>
+      </w:r>
+      <w:r>
+        <w:rPr>
+          <w:rFonts w:ascii="Times New Roman" w:cs="Times New Roman" w:eastAsia="Times New Roman" w:hAnsi="Times New Roman"/>
+          <w:i/>
+          <w:iCs/>
+          <w:sz w:val="20"/>
+          <w:szCs w:val="20"/>
+        </w:rPr>
+        <w:t xml:space="preserve"/>
+      </w:r>
+      <w:r>
+        <w:rPr>
+          <w:rFonts w:ascii="Times New Roman" w:cs="Times New Roman" w:eastAsia="Times New Roman" w:hAnsi="Times New Roman"/>
+          <w:sz w:val="20"/>
+          <w:szCs w:val="20"/>
+        </w:rPr>
+        <w:t xml:space="preserve"> [Preprint]. arXiv:2510.03884. </w:t>
+      </w:r>
+      <w:hyperlink w:history="1" r:id="rId-0wclb_otdy5f4jms4guw">
         <w:r>
           <w:rPr>
             <w:rStyle w:val="Hyperlink"/>
             <w:rFonts w:ascii="Times New Roman" w:cs="Times New Roman" w:eastAsia="Times New Roman" w:hAnsi="Times New Roman"/>
           </w:rPr>
-          <w:t xml:space="preserve">https://www.unesco.org/en/articles/guidance-generative-ai-education-and-research</w:t>
+          <w:t xml:space="preserve">https://arxiv.org/abs/2510.03884</w:t>
         </w:r>
       </w:hyperlink>
     </w:p>
@@ -3424,33 +4025,33 @@
           <w:sz w:val="20"/>
           <w:szCs w:val="20"/>
         </w:rPr>
-        <w:t xml:space="preserve">United Nations Educational, Scientific and Cultural Organization. (2024). </w:t>
-      </w:r>
-      <w:r>
-        <w:rPr>
-          <w:rFonts w:ascii="Times New Roman" w:cs="Times New Roman" w:eastAsia="Times New Roman" w:hAnsi="Times New Roman"/>
-          <w:i/>
-          <w:iCs/>
-          <w:sz w:val="20"/>
-          <w:szCs w:val="20"/>
-        </w:rPr>
-        <w:t xml:space="preserve">AI competency frameworks for students and teachers</w:t>
-      </w:r>
-      <w:r>
-        <w:rPr>
-          <w:rFonts w:ascii="Times New Roman" w:cs="Times New Roman" w:eastAsia="Times New Roman" w:hAnsi="Times New Roman"/>
-          <w:sz w:val="20"/>
-          <w:szCs w:val="20"/>
-        </w:rPr>
-        <w:t xml:space="preserve">. UNESCO. </w:t>
-      </w:r>
-      <w:hyperlink w:history="1" r:id="rIdghpc0x80vmfrxuvg-odkm">
+        <w:t xml:space="preserve">UNESCO. (2023). </w:t>
+      </w:r>
+      <w:r>
+        <w:rPr>
+          <w:rFonts w:ascii="Times New Roman" w:cs="Times New Roman" w:eastAsia="Times New Roman" w:hAnsi="Times New Roman"/>
+          <w:i/>
+          <w:iCs/>
+          <w:sz w:val="20"/>
+          <w:szCs w:val="20"/>
+        </w:rPr>
+        <w:t xml:space="preserve">Guidance for generative AI in education and research</w:t>
+      </w:r>
+      <w:r>
+        <w:rPr>
+          <w:rFonts w:ascii="Times New Roman" w:cs="Times New Roman" w:eastAsia="Times New Roman" w:hAnsi="Times New Roman"/>
+          <w:sz w:val="20"/>
+          <w:szCs w:val="20"/>
+        </w:rPr>
+        <w:t xml:space="preserve"> (F. Miao &amp; W. Holmes, Authors). </w:t>
+      </w:r>
+      <w:hyperlink w:history="1" r:id="rIdztkmqahmhytlr4slbpi6s">
         <w:r>
           <w:rPr>
             <w:rStyle w:val="Hyperlink"/>
             <w:rFonts w:ascii="Times New Roman" w:cs="Times New Roman" w:eastAsia="Times New Roman" w:hAnsi="Times New Roman"/>
           </w:rPr>
-          <w:t xml:space="preserve">https://www.unesco.org/en/articles/ai-competency-framework-students</w:t>
+          <w:t xml:space="preserve">https://doi.org/10.54675/EWZM9535</w:t>
         </w:r>
       </w:hyperlink>
     </w:p>
@@ -3466,33 +4067,33 @@
           <w:sz w:val="20"/>
           <w:szCs w:val="20"/>
         </w:rPr>
-        <w:t xml:space="preserve">World Bank. (2025). </w:t>
-      </w:r>
-      <w:r>
-        <w:rPr>
-          <w:rFonts w:ascii="Times New Roman" w:cs="Times New Roman" w:eastAsia="Times New Roman" w:hAnsi="Times New Roman"/>
-          <w:i/>
-          <w:iCs/>
-          <w:sz w:val="20"/>
-          <w:szCs w:val="20"/>
-        </w:rPr>
-        <w:t xml:space="preserve">From chalkboards to chatbots: Evaluating the impact of generative AI on learning outcomes in Nigeria</w:t>
-      </w:r>
-      <w:r>
-        <w:rPr>
-          <w:rFonts w:ascii="Times New Roman" w:cs="Times New Roman" w:eastAsia="Times New Roman" w:hAnsi="Times New Roman"/>
-          <w:sz w:val="20"/>
-          <w:szCs w:val="20"/>
-        </w:rPr>
-        <w:t xml:space="preserve"> (Policy Research Working Paper 11125). </w:t>
-      </w:r>
-      <w:hyperlink w:history="1" r:id="rId3fa7ppsro_zvinxv4frlc">
+        <w:t xml:space="preserve">UNESCO. (2024). </w:t>
+      </w:r>
+      <w:r>
+        <w:rPr>
+          <w:rFonts w:ascii="Times New Roman" w:cs="Times New Roman" w:eastAsia="Times New Roman" w:hAnsi="Times New Roman"/>
+          <w:i/>
+          <w:iCs/>
+          <w:sz w:val="20"/>
+          <w:szCs w:val="20"/>
+        </w:rPr>
+        <w:t xml:space="preserve">AI competency framework for students; AI competency framework for teachers</w:t>
+      </w:r>
+      <w:r>
+        <w:rPr>
+          <w:rFonts w:ascii="Times New Roman" w:cs="Times New Roman" w:eastAsia="Times New Roman" w:hAnsi="Times New Roman"/>
+          <w:sz w:val="20"/>
+          <w:szCs w:val="20"/>
+        </w:rPr>
+        <w:t xml:space="preserve">. </w:t>
+      </w:r>
+      <w:hyperlink w:history="1" r:id="rIds-hyd1sk0men8ljbo7qwx">
         <w:r>
           <w:rPr>
             <w:rStyle w:val="Hyperlink"/>
             <w:rFonts w:ascii="Times New Roman" w:cs="Times New Roman" w:eastAsia="Times New Roman" w:hAnsi="Times New Roman"/>
           </w:rPr>
-          <w:t xml:space="preserve">https://documents.worldbank.org/en/publication/documents-reports/documentdetail/099548105192529324</w:t>
+          <w:t xml:space="preserve">https://doi.org/10.54675/JKJB9835</w:t>
         </w:r>
       </w:hyperlink>
     </w:p>
@@ -3508,6 +4109,90 @@
           <w:sz w:val="20"/>
           <w:szCs w:val="20"/>
         </w:rPr>
+        <w:t xml:space="preserve">UNESCO. (n.d.). </w:t>
+      </w:r>
+      <w:r>
+        <w:rPr>
+          <w:rFonts w:ascii="Times New Roman" w:cs="Times New Roman" w:eastAsia="Times New Roman" w:hAnsi="Times New Roman"/>
+          <w:i/>
+          <w:iCs/>
+          <w:sz w:val="20"/>
+          <w:szCs w:val="20"/>
+        </w:rPr>
+        <w:t xml:space="preserve">Ghost in the chatbot: The perils of parasocial attachment</w:t>
+      </w:r>
+      <w:r>
+        <w:rPr>
+          <w:rFonts w:ascii="Times New Roman" w:cs="Times New Roman" w:eastAsia="Times New Roman" w:hAnsi="Times New Roman"/>
+          <w:sz w:val="20"/>
+          <w:szCs w:val="20"/>
+        </w:rPr>
+        <w:t xml:space="preserve">. Retrieved 2026, from </w:t>
+      </w:r>
+      <w:hyperlink w:history="1" r:id="rIddgzgtgoacphh901iwciab">
+        <w:r>
+          <w:rPr>
+            <w:rStyle w:val="Hyperlink"/>
+            <w:rFonts w:ascii="Times New Roman" w:cs="Times New Roman" w:eastAsia="Times New Roman" w:hAnsi="Times New Roman"/>
+          </w:rPr>
+          <w:t xml:space="preserve">https://www.unesco.org/en/articles/ghost-chatbot-perils-parasocial-attachment</w:t>
+        </w:r>
+      </w:hyperlink>
+    </w:p>
+    <w:p>
+      <w:pPr>
+        <w:spacing w:after="100" w:line="300"/>
+        <w:ind w:left="720" w:hanging="720"/>
+        <w:jc w:val="left"/>
+      </w:pPr>
+      <w:r>
+        <w:rPr>
+          <w:rFonts w:ascii="Times New Roman" w:cs="Times New Roman" w:eastAsia="Times New Roman" w:hAnsi="Times New Roman"/>
+          <w:sz w:val="20"/>
+          <w:szCs w:val="20"/>
+        </w:rPr>
+        <w:t xml:space="preserve">Wang, J., &amp; Fan, W. (2025). The effect of ChatGPT on students’ learning performance, learning perception, and higher-order thinking: Insights from a meta-analysis [Retracted]. </w:t>
+      </w:r>
+      <w:r>
+        <w:rPr>
+          <w:rFonts w:ascii="Times New Roman" w:cs="Times New Roman" w:eastAsia="Times New Roman" w:hAnsi="Times New Roman"/>
+          <w:i/>
+          <w:iCs/>
+          <w:sz w:val="20"/>
+          <w:szCs w:val="20"/>
+        </w:rPr>
+        <w:t xml:space="preserve">Humanities and Social Sciences Communications, 12</w:t>
+      </w:r>
+      <w:r>
+        <w:rPr>
+          <w:rFonts w:ascii="Times New Roman" w:cs="Times New Roman" w:eastAsia="Times New Roman" w:hAnsi="Times New Roman"/>
+          <w:sz w:val="20"/>
+          <w:szCs w:val="20"/>
+        </w:rPr>
+        <w:t xml:space="preserve">(1). </w:t>
+      </w:r>
+      <w:hyperlink w:history="1" r:id="rId2peijweluebih8hie78jd">
+        <w:r>
+          <w:rPr>
+            <w:rStyle w:val="Hyperlink"/>
+            <w:rFonts w:ascii="Times New Roman" w:cs="Times New Roman" w:eastAsia="Times New Roman" w:hAnsi="Times New Roman"/>
+          </w:rPr>
+          <w:t xml:space="preserve">https://doi.org/10.1057/s41599-025-04787-y</w:t>
+        </w:r>
+      </w:hyperlink>
+    </w:p>
+    <w:p>
+      <w:pPr>
+        <w:spacing w:after="100" w:line="300"/>
+        <w:ind w:left="720" w:hanging="720"/>
+        <w:jc w:val="left"/>
+      </w:pPr>
+      <w:r>
+        <w:rPr>
+          <w:rFonts w:ascii="Times New Roman" w:cs="Times New Roman" w:eastAsia="Times New Roman" w:hAnsi="Times New Roman"/>
+          <w:sz w:val="20"/>
+          <w:szCs w:val="20"/>
+        </w:rPr>
         <w:t xml:space="preserve">Yan, L. (2025). </w:t>
       </w:r>
       <w:r>
@@ -3526,9 +4211,9 @@
           <w:sz w:val="20"/>
           <w:szCs w:val="20"/>
         </w:rPr>
-        <w:t xml:space="preserve"> (arXiv:2508.14825). arXiv. </w:t>
-      </w:r>
-      <w:hyperlink w:history="1" r:id="rIdzyqrzbeslogxnd0abvjrv">
+        <w:t xml:space="preserve"> [Preprint]. arXiv:2508.14825. </w:t>
+      </w:r>
+      <w:hyperlink w:history="1" r:id="rIdje3rvtzp-j4a1rivq3chl">
         <w:r>
           <w:rPr>
             <w:rStyle w:val="Hyperlink"/>
@@ -3550,33 +4235,33 @@
           <w:sz w:val="20"/>
           <w:szCs w:val="20"/>
         </w:rPr>
-        <w:t xml:space="preserve">Yang, S., Wang, J., et al. (2025). </w:t>
-      </w:r>
-      <w:r>
-        <w:rPr>
-          <w:rFonts w:ascii="Times New Roman" w:cs="Times New Roman" w:eastAsia="Times New Roman" w:hAnsi="Times New Roman"/>
-          <w:i/>
-          <w:iCs/>
-          <w:sz w:val="20"/>
-          <w:szCs w:val="20"/>
-        </w:rPr>
-        <w:t xml:space="preserve">LLM agents for education: Advances and applications</w:t>
-      </w:r>
-      <w:r>
-        <w:rPr>
-          <w:rFonts w:ascii="Times New Roman" w:cs="Times New Roman" w:eastAsia="Times New Roman" w:hAnsi="Times New Roman"/>
-          <w:sz w:val="20"/>
-          <w:szCs w:val="20"/>
-        </w:rPr>
-        <w:t xml:space="preserve">. Findings of EMNLP 2025 (arXiv:2503.11733). </w:t>
-      </w:r>
-      <w:hyperlink w:history="1" r:id="rIdgmervmvjq-ynu1exf_qbq">
+        <w:t xml:space="preserve">Yu, H., Zhou, J., Li, L., Chen, S., Gallifant, J., Shi, A., Sun, J., Li, X., He, J., Hua, W., … Fan, L. (2025). Simulated patient systems powered by large language model-based AI agents offer potential for transforming medical education. </w:t>
+      </w:r>
+      <w:r>
+        <w:rPr>
+          <w:rFonts w:ascii="Times New Roman" w:cs="Times New Roman" w:eastAsia="Times New Roman" w:hAnsi="Times New Roman"/>
+          <w:i/>
+          <w:iCs/>
+          <w:sz w:val="20"/>
+          <w:szCs w:val="20"/>
+        </w:rPr>
+        <w:t xml:space="preserve">Communications Medicine, 5</w:t>
+      </w:r>
+      <w:r>
+        <w:rPr>
+          <w:rFonts w:ascii="Times New Roman" w:cs="Times New Roman" w:eastAsia="Times New Roman" w:hAnsi="Times New Roman"/>
+          <w:sz w:val="20"/>
+          <w:szCs w:val="20"/>
+        </w:rPr>
+        <w:t xml:space="preserve">, Article 525. </w:t>
+      </w:r>
+      <w:hyperlink w:history="1" r:id="rIdfwvy8q40jeibowyyks2ry">
         <w:r>
           <w:rPr>
             <w:rStyle w:val="Hyperlink"/>
             <w:rFonts w:ascii="Times New Roman" w:cs="Times New Roman" w:eastAsia="Times New Roman" w:hAnsi="Times New Roman"/>
           </w:rPr>
-          <w:t xml:space="preserve">https://aclanthology.org/2025.findings-emnlp.743.pdf</w:t>
+          <w:t xml:space="preserve">https://doi.org/10.1038/s43856-025-01283-x</w:t>
         </w:r>
       </w:hyperlink>
     </w:p>
@@ -3592,33 +4277,75 @@
           <w:sz w:val="20"/>
           <w:szCs w:val="20"/>
         </w:rPr>
-        <w:t xml:space="preserve">Zhu, S., Sun, Y., &amp; Yang, H. H. (2025). Towards responsible artificial intelligence in education: A systematic review on identifying and mitigating ethical risks. </w:t>
-      </w:r>
-      <w:r>
-        <w:rPr>
-          <w:rFonts w:ascii="Times New Roman" w:cs="Times New Roman" w:eastAsia="Times New Roman" w:hAnsi="Times New Roman"/>
-          <w:i/>
-          <w:iCs/>
-          <w:sz w:val="20"/>
-          <w:szCs w:val="20"/>
-        </w:rPr>
-        <w:t xml:space="preserve">Humanities and Social Sciences Communications</w:t>
-      </w:r>
-      <w:r>
-        <w:rPr>
-          <w:rFonts w:ascii="Times New Roman" w:cs="Times New Roman" w:eastAsia="Times New Roman" w:hAnsi="Times New Roman"/>
-          <w:sz w:val="20"/>
-          <w:szCs w:val="20"/>
-        </w:rPr>
-        <w:t xml:space="preserve">. </w:t>
-      </w:r>
-      <w:hyperlink w:history="1" r:id="rIdup78xje7xrl2-2lqlxusy">
+        <w:t xml:space="preserve">Zhang, L., Deng, X., &amp; Shadiev, R. (2026). A meta-review of generative AI in education: Synthesizing findings from systematic reviews. </w:t>
+      </w:r>
+      <w:r>
+        <w:rPr>
+          <w:rFonts w:ascii="Times New Roman" w:cs="Times New Roman" w:eastAsia="Times New Roman" w:hAnsi="Times New Roman"/>
+          <w:i/>
+          <w:iCs/>
+          <w:sz w:val="20"/>
+          <w:szCs w:val="20"/>
+        </w:rPr>
+        <w:t xml:space="preserve">Journal of Educational Computing Research, 64</w:t>
+      </w:r>
+      <w:r>
+        <w:rPr>
+          <w:rFonts w:ascii="Times New Roman" w:cs="Times New Roman" w:eastAsia="Times New Roman" w:hAnsi="Times New Roman"/>
+          <w:sz w:val="20"/>
+          <w:szCs w:val="20"/>
+        </w:rPr>
+        <w:t xml:space="preserve">(4), 1068–1092. </w:t>
+      </w:r>
+      <w:hyperlink w:history="1" r:id="rIdmsyqhkrm8pful0qly9vlb">
         <w:r>
           <w:rPr>
             <w:rStyle w:val="Hyperlink"/>
             <w:rFonts w:ascii="Times New Roman" w:cs="Times New Roman" w:eastAsia="Times New Roman" w:hAnsi="Times New Roman"/>
           </w:rPr>
-          <w:t xml:space="preserve">https://www.nature.com/articles/s41599-025-05252-6</w:t>
+          <w:t xml:space="preserve">https://doi.org/10.1177/07356331261419689</w:t>
+        </w:r>
+      </w:hyperlink>
+    </w:p>
+    <w:p>
+      <w:pPr>
+        <w:spacing w:after="100" w:line="300"/>
+        <w:ind w:left="720" w:hanging="720"/>
+        <w:jc w:val="left"/>
+      </w:pPr>
+      <w:r>
+        <w:rPr>
+          <w:rFonts w:ascii="Times New Roman" w:cs="Times New Roman" w:eastAsia="Times New Roman" w:hAnsi="Times New Roman"/>
+          <w:sz w:val="20"/>
+          <w:szCs w:val="20"/>
+        </w:rPr>
+        <w:t xml:space="preserve">Zhu, H., Sun, Y., &amp; Yang, J. (2025). Towards responsible artificial intelligence in education: A systematic review on identifying and mitigating ethical risks. </w:t>
+      </w:r>
+      <w:r>
+        <w:rPr>
+          <w:rFonts w:ascii="Times New Roman" w:cs="Times New Roman" w:eastAsia="Times New Roman" w:hAnsi="Times New Roman"/>
+          <w:i/>
+          <w:iCs/>
+          <w:sz w:val="20"/>
+          <w:szCs w:val="20"/>
+        </w:rPr>
+        <w:t xml:space="preserve">Humanities and Social Sciences Communications, 12</w:t>
+      </w:r>
+      <w:r>
+        <w:rPr>
+          <w:rFonts w:ascii="Times New Roman" w:cs="Times New Roman" w:eastAsia="Times New Roman" w:hAnsi="Times New Roman"/>
+          <w:sz w:val="20"/>
+          <w:szCs w:val="20"/>
+        </w:rPr>
+        <w:t xml:space="preserve">(1), Article 1306. </w:t>
+      </w:r>
+      <w:hyperlink w:history="1" r:id="rIdijpyqk9yhqx0ks68qq8g2">
+        <w:r>
+          <w:rPr>
+            <w:rStyle w:val="Hyperlink"/>
+            <w:rFonts w:ascii="Times New Roman" w:cs="Times New Roman" w:eastAsia="Times New Roman" w:hAnsi="Times New Roman"/>
+          </w:rPr>
+          <w:t xml:space="preserve">https://doi.org/10.1057/s41599-025-05252-6</w:t>
         </w:r>
       </w:hyperlink>
     </w:p>

</xml_diff>

<commit_message>
Add five data-driven figures to manuscript
- Figure 1: review/verification workflow (Methods)
- Figure 2: conceptual evolution ITS -> generative -> agentic
- Figure 3: forest plot of effect sizes (retracted estimate flagged)
- Figure 4: design-dependent dissociation (Bastani et al.)
- Figure 5: governance timeline 2023-2025
All values drawn from verified cited sources; figures embedded with
journal-style numbered captions and source lines. Adds build-figures.py.

https://claude.ai/code/session_01YW6bjEw6DSrD5H7JmH8dwe
</commit_message>
<xml_diff>
--- a/Agentic-AI-in-Education-Narrative-Review.docx
+++ b/Agentic-AI-in-Education-Narrative-Review.docx
@@ -426,6 +426,77 @@
     </w:p>
     <w:p>
       <w:pPr>
+        <w:keepNext/>
+        <w:spacing w:after="40" w:before="200"/>
+        <w:jc w:val="center"/>
+      </w:pPr>
+      <w:r>
+        <w:drawing>
+          <wp:inline distT="0" distB="0" distL="0" distR="0">
+            <wp:extent cx="5619750" cy="2514600"/>
+            <wp:effectExtent t="0" r="0" b="0" l="0"/>
+            <wp:docPr id="1" name="Figure 1." descr="Structured narrative-review and adversarial-verification workflow. Five thematic search angles fed source screening (~40 retained, 2023–2026); twelve load-bearing claims were each independently checked three times, of which eleven were confirmed and one rejected as a misattributed statistic, before synthesis into 36 bibliographically re-verified references." title="Figure 1."/>
+            <wp:cNvGraphicFramePr>
+              <a:graphicFrameLocks xmlns:a="http://schemas.openxmlformats.org/drawingml/2006/main" noChangeAspect="1"/>
+            </wp:cNvGraphicFramePr>
+            <a:graphic xmlns:a="http://schemas.openxmlformats.org/drawingml/2006/main">
+              <a:graphicData uri="http://schemas.openxmlformats.org/drawingml/2006/picture">
+                <pic:pic xmlns:pic="http://schemas.openxmlformats.org/drawingml/2006/picture">
+                  <pic:nvPicPr>
+                    <pic:cNvPr id="0" name="" descr=""/>
+                    <pic:cNvPicPr>
+                      <a:picLocks noChangeAspect="1" noChangeArrowheads="1"/>
+                    </pic:cNvPicPr>
+                  </pic:nvPicPr>
+                  <pic:blipFill>
+                    <a:blip r:embed="rId9" cstate="none"/>
+                    <a:srcRect/>
+                    <a:stretch>
+                      <a:fillRect/>
+                    </a:stretch>
+                  </pic:blipFill>
+                  <pic:spPr bwMode="auto">
+                    <a:xfrm>
+                      <a:off x="0" y="0"/>
+                      <a:ext cx="5619750" cy="2514600"/>
+                    </a:xfrm>
+                    <a:prstGeom prst="rect">
+                      <a:avLst/>
+                    </a:prstGeom>
+                  </pic:spPr>
+                </pic:pic>
+              </a:graphicData>
+            </a:graphic>
+          </wp:inline>
+        </w:drawing>
+      </w:r>
+    </w:p>
+    <w:p>
+      <w:pPr>
+        <w:spacing w:after="200" w:line="260"/>
+        <w:jc w:val="both"/>
+      </w:pPr>
+      <w:r>
+        <w:rPr>
+          <w:rFonts w:ascii="Times New Roman" w:cs="Times New Roman" w:eastAsia="Times New Roman" w:hAnsi="Times New Roman"/>
+          <w:b/>
+          <w:bCs/>
+          <w:sz w:val="18"/>
+          <w:szCs w:val="18"/>
+        </w:rPr>
+        <w:t xml:space="preserve">Figure 1. </w:t>
+      </w:r>
+      <w:r>
+        <w:rPr>
+          <w:rFonts w:ascii="Times New Roman" w:cs="Times New Roman" w:eastAsia="Times New Roman" w:hAnsi="Times New Roman"/>
+          <w:sz w:val="18"/>
+          <w:szCs w:val="18"/>
+        </w:rPr>
+        <w:t xml:space="preserve">Structured narrative-review and adversarial-verification workflow. Five thematic search angles fed source screening (~40 retained, 2023–2026); twelve load-bearing claims were each independently checked three times, of which eleven were confirmed and one rejected as a misattributed statistic, before synthesis into 36 bibliographically re-verified references.</w:t>
+      </w:r>
+    </w:p>
+    <w:p>
+      <w:pPr>
         <w:pStyle w:val="Heading1"/>
         <w:spacing w:after="140" w:before="280"/>
       </w:pPr>
@@ -485,6 +556,77 @@
           <w:rFonts w:ascii="Times New Roman" w:cs="Times New Roman" w:eastAsia="Times New Roman" w:hAnsi="Times New Roman"/>
         </w:rPr>
         <w:t xml:space="preserve">First, terminology is inconsistent: many education papers use “AI agent” and “agentic AI” interchangeably, whereas Sapkota et al. (2025) treat them as distinct paradigms. Second, the asserted leap beyond classical ITS—that agentic systems reason about goals and generate novel instructional strategies rather than following scripted branching—is largely conceptual and not yet demonstrated through rigorous comparative evidence. Third, a normative tension is visible between the academic literature, which embraces autonomy, and institutional bodies such as UNESCO and the OECD, which deliberately avoid “agentic” language and foreground human agency, accountability, and oversight.</w:t>
+      </w:r>
+    </w:p>
+    <w:p>
+      <w:pPr>
+        <w:keepNext/>
+        <w:spacing w:after="40" w:before="200"/>
+        <w:jc w:val="center"/>
+      </w:pPr>
+      <w:r>
+        <w:drawing>
+          <wp:inline distT="0" distB="0" distL="0" distR="0">
+            <wp:extent cx="5619750" cy="2695575"/>
+            <wp:effectExtent t="0" r="0" b="0" l="0"/>
+            <wp:docPr id="1" name="Figure 2." descr="From passive tools to autonomous agents: the evolution of AI in education. Agentic systems are distinguished from earlier paradigms by autonomy, goal-directed planning, tool use, persistent memory, and multi-agent orchestration. Synthesised from Kamalov et al. (2025), Sapkota et al. (2025), and Yan (2025)." title="Figure 2."/>
+            <wp:cNvGraphicFramePr>
+              <a:graphicFrameLocks xmlns:a="http://schemas.openxmlformats.org/drawingml/2006/main" noChangeAspect="1"/>
+            </wp:cNvGraphicFramePr>
+            <a:graphic xmlns:a="http://schemas.openxmlformats.org/drawingml/2006/main">
+              <a:graphicData uri="http://schemas.openxmlformats.org/drawingml/2006/picture">
+                <pic:pic xmlns:pic="http://schemas.openxmlformats.org/drawingml/2006/picture">
+                  <pic:nvPicPr>
+                    <pic:cNvPr id="0" name="" descr=""/>
+                    <pic:cNvPicPr>
+                      <a:picLocks noChangeAspect="1" noChangeArrowheads="1"/>
+                    </pic:cNvPicPr>
+                  </pic:nvPicPr>
+                  <pic:blipFill>
+                    <a:blip r:embed="rId10" cstate="none"/>
+                    <a:srcRect/>
+                    <a:stretch>
+                      <a:fillRect/>
+                    </a:stretch>
+                  </pic:blipFill>
+                  <pic:spPr bwMode="auto">
+                    <a:xfrm>
+                      <a:off x="0" y="0"/>
+                      <a:ext cx="5619750" cy="2695575"/>
+                    </a:xfrm>
+                    <a:prstGeom prst="rect">
+                      <a:avLst/>
+                    </a:prstGeom>
+                  </pic:spPr>
+                </pic:pic>
+              </a:graphicData>
+            </a:graphic>
+          </wp:inline>
+        </w:drawing>
+      </w:r>
+    </w:p>
+    <w:p>
+      <w:pPr>
+        <w:spacing w:after="200" w:line="260"/>
+        <w:jc w:val="both"/>
+      </w:pPr>
+      <w:r>
+        <w:rPr>
+          <w:rFonts w:ascii="Times New Roman" w:cs="Times New Roman" w:eastAsia="Times New Roman" w:hAnsi="Times New Roman"/>
+          <w:b/>
+          <w:bCs/>
+          <w:sz w:val="18"/>
+          <w:szCs w:val="18"/>
+        </w:rPr>
+        <w:t xml:space="preserve">Figure 2. </w:t>
+      </w:r>
+      <w:r>
+        <w:rPr>
+          <w:rFonts w:ascii="Times New Roman" w:cs="Times New Roman" w:eastAsia="Times New Roman" w:hAnsi="Times New Roman"/>
+          <w:sz w:val="18"/>
+          <w:szCs w:val="18"/>
+        </w:rPr>
+        <w:t xml:space="preserve">From passive tools to autonomous agents: the evolution of AI in education. Agentic systems are distinguished from earlier paradigms by autonomy, goal-directed planning, tool use, persistent memory, and multi-agent orchestration. Synthesised from Kamalov et al. (2025), Sapkota et al. (2025), and Yan (2025).</w:t>
       </w:r>
     </w:p>
     <w:p>
@@ -1813,7 +1955,78 @@
         <w:rPr>
           <w:rFonts w:ascii="Times New Roman" w:cs="Times New Roman" w:eastAsia="Times New Roman" w:hAnsi="Times New Roman"/>
         </w:rPr>
-        <w:t xml:space="preserve">Convergent 2026 meta-analytic work situates the effect as moderate and, crucially, pedagogy-dependent. A meta-analysis confined to generative-AI pedagogical agents reported g = 0.401, with stronger effects under teacher-directed than self-directed learning (Cheng et al., 2026), while a meta-review synthesising prior systematic reviews reached similar conclusions about the centrality of instructional design (Zhang et al., 2026). A 2026 systematic review of higher education likewise reported mixed, discipline-dependent outcomes alongside engagement gains, reinforcing the call for longitudinal evidence (Hon, 2026). Taken together, these syntheses caution against headline point estimates and favour a range bounded by the conditions of use.</w:t>
+        <w:t xml:space="preserve">Convergent 2026 meta-analytic work situates the effect as moderate and, crucially, pedagogy-dependent. A meta-analysis confined to generative-AI pedagogical agents reported g = 0.401, with stronger effects under teacher-directed than self-directed learning (Cheng et al., 2026), while a meta-review synthesising prior systematic reviews reached similar conclusions about the centrality of instructional design (Zhang et al., 2026). A 2026 systematic review of higher education likewise reported mixed, discipline-dependent outcomes alongside engagement gains, reinforcing the call for longitudinal evidence (Hon, 2026). Taken together, these syntheses caution against headline point estimates and favour a range bounded by the conditions of use (Figure 3).</w:t>
+      </w:r>
+    </w:p>
+    <w:p>
+      <w:pPr>
+        <w:keepNext/>
+        <w:spacing w:after="40" w:before="200"/>
+        <w:jc w:val="center"/>
+      </w:pPr>
+      <w:r>
+        <w:drawing>
+          <wp:inline distT="0" distB="0" distL="0" distR="0">
+            <wp:extent cx="5619750" cy="2352675"/>
+            <wp:effectExtent t="0" r="0" b="0" l="0"/>
+            <wp:docPr id="1" name="Figure 3." descr="Reported standardized effect sizes for AI and generative-AI on learning outcomes. Metrics, comparators, and contexts differ across studies and are not directly poolable; values are shown for orientation only. Whiskers denote the 95% confidence interval (Liu et al., 2025) or the authors’ reported range (Kestin et al., 2025). The retracted estimate (Wang &amp; Fan, 2025) is included solely as a cautionary marker. Sources: Liu et al. (2025); Kestin et al. (2025); Cheng et al. (2026); De Simone et al. (2025)." title="Figure 3."/>
+            <wp:cNvGraphicFramePr>
+              <a:graphicFrameLocks xmlns:a="http://schemas.openxmlformats.org/drawingml/2006/main" noChangeAspect="1"/>
+            </wp:cNvGraphicFramePr>
+            <a:graphic xmlns:a="http://schemas.openxmlformats.org/drawingml/2006/main">
+              <a:graphicData uri="http://schemas.openxmlformats.org/drawingml/2006/picture">
+                <pic:pic xmlns:pic="http://schemas.openxmlformats.org/drawingml/2006/picture">
+                  <pic:nvPicPr>
+                    <pic:cNvPr id="0" name="" descr=""/>
+                    <pic:cNvPicPr>
+                      <a:picLocks noChangeAspect="1" noChangeArrowheads="1"/>
+                    </pic:cNvPicPr>
+                  </pic:nvPicPr>
+                  <pic:blipFill>
+                    <a:blip r:embed="rId11" cstate="none"/>
+                    <a:srcRect/>
+                    <a:stretch>
+                      <a:fillRect/>
+                    </a:stretch>
+                  </pic:blipFill>
+                  <pic:spPr bwMode="auto">
+                    <a:xfrm>
+                      <a:off x="0" y="0"/>
+                      <a:ext cx="5619750" cy="2352675"/>
+                    </a:xfrm>
+                    <a:prstGeom prst="rect">
+                      <a:avLst/>
+                    </a:prstGeom>
+                  </pic:spPr>
+                </pic:pic>
+              </a:graphicData>
+            </a:graphic>
+          </wp:inline>
+        </w:drawing>
+      </w:r>
+    </w:p>
+    <w:p>
+      <w:pPr>
+        <w:spacing w:after="200" w:line="260"/>
+        <w:jc w:val="both"/>
+      </w:pPr>
+      <w:r>
+        <w:rPr>
+          <w:rFonts w:ascii="Times New Roman" w:cs="Times New Roman" w:eastAsia="Times New Roman" w:hAnsi="Times New Roman"/>
+          <w:b/>
+          <w:bCs/>
+          <w:sz w:val="18"/>
+          <w:szCs w:val="18"/>
+        </w:rPr>
+        <w:t xml:space="preserve">Figure 3. </w:t>
+      </w:r>
+      <w:r>
+        <w:rPr>
+          <w:rFonts w:ascii="Times New Roman" w:cs="Times New Roman" w:eastAsia="Times New Roman" w:hAnsi="Times New Roman"/>
+          <w:sz w:val="18"/>
+          <w:szCs w:val="18"/>
+        </w:rPr>
+        <w:t xml:space="preserve">Reported standardized effect sizes for AI and generative-AI on learning outcomes. Metrics, comparators, and contexts differ across studies and are not directly poolable; values are shown for orientation only. Whiskers denote the 95% confidence interval (Liu et al., 2025) or the authors’ reported range (Kestin et al., 2025). The retracted estimate (Wang &amp; Fan, 2025) is included solely as a cautionary marker. Sources: Liu et al. (2025); Kestin et al. (2025); Cheng et al. (2026); De Simone et al. (2025).</w:t>
       </w:r>
     </w:p>
     <w:p>
@@ -1844,7 +2057,78 @@
         <w:rPr>
           <w:rFonts w:ascii="Times New Roman" w:cs="Times New Roman" w:eastAsia="Times New Roman" w:hAnsi="Times New Roman"/>
         </w:rPr>
-        <w:t xml:space="preserve">Countervailing evidence is equally rigorous. In a field randomised controlled trial in Turkish secondary mathematics, students using unguarded GPT-4 improved during practice but, once AI access was removed, scored approximately 17% worse on examinations than peers who never had access; critically, a guardrailed “tutor” variant that offered hints rather than answers eliminated this harm (Bastani et al., 2025). This provides the strongest causal evidence that the detriment is design-dependent rather than intrinsic. Convergent findings include reduced self-regulated learning and absent transfer gains despite better short-term essays (“metacognitive laziness”; Fan et al., 2025); superficial learning under over-reliance in 65.5% of fifty-eight programming-education studies (Teaching with AI, 2025); and a preprint EEG study in which LLM users showed the weakest neural connectivity and 83% could not quote from an essay they had just written (Kosmyna et al., 2025). The last is reported here as suggestive only, given its small sample (N = 54) and non-peer-reviewed status. Learner-side accounts corroborate the over-reliance mechanism: a 2026 thematic analysis found that students encountered fabricated citations and overconfident, sycophantic responses, and developed ad hoc verification strategies in response (Shoufan &amp; Esmaeil, 2026).</w:t>
+        <w:t xml:space="preserve">Countervailing evidence is equally rigorous. In a field randomised controlled trial in Turkish secondary mathematics, students using unguarded GPT-4 improved during practice but, once AI access was removed, scored approximately 17% worse on examinations than peers who never had access; critically, a guardrailed “tutor” variant that offered hints rather than answers eliminated this harm (Bastani et al., 2025). This provides the strongest causal evidence that the detriment is design-dependent rather than intrinsic (Figure 4). Convergent findings include reduced self-regulated learning and absent transfer gains despite better short-term essays (“metacognitive laziness”; Fan et al., 2025); superficial learning under over-reliance in 65.5% of fifty-eight programming-education studies (Teaching with AI, 2025); and a preprint EEG study in which LLM users showed the weakest neural connectivity and 83% could not quote from an essay they had just written (Kosmyna et al., 2025). The last is reported here as suggestive only, given its small sample (N = 54) and non-peer-reviewed status. Learner-side accounts corroborate the over-reliance mechanism: a 2026 thematic analysis found that students encountered fabricated citations and overconfident, sycophantic responses, and developed ad hoc verification strategies in response (Shoufan &amp; Esmaeil, 2026).</w:t>
+      </w:r>
+    </w:p>
+    <w:p>
+      <w:pPr>
+        <w:keepNext/>
+        <w:spacing w:after="40" w:before="200"/>
+        <w:jc w:val="center"/>
+      </w:pPr>
+      <w:r>
+        <w:drawing>
+          <wp:inline distT="0" distB="0" distL="0" distR="0">
+            <wp:extent cx="5619750" cy="2762250"/>
+            <wp:effectExtent t="0" r="0" b="0" l="0"/>
+            <wp:docPr id="1" name="Figure 4." descr="The design-dependent dissociation between immediate output and durable learning (Bastani et al., 2025). During practice, both AI groups improved; on the subsequent AI-free examination, unguarded GPT use reduced scores by approximately 17% relative to students who never had AI, whereas a hint-only guardrailed tutor eliminated the harm. Values are indexed to the control group (= 100)." title="Figure 4."/>
+            <wp:cNvGraphicFramePr>
+              <a:graphicFrameLocks xmlns:a="http://schemas.openxmlformats.org/drawingml/2006/main" noChangeAspect="1"/>
+            </wp:cNvGraphicFramePr>
+            <a:graphic xmlns:a="http://schemas.openxmlformats.org/drawingml/2006/main">
+              <a:graphicData uri="http://schemas.openxmlformats.org/drawingml/2006/picture">
+                <pic:pic xmlns:pic="http://schemas.openxmlformats.org/drawingml/2006/picture">
+                  <pic:nvPicPr>
+                    <pic:cNvPr id="0" name="" descr=""/>
+                    <pic:cNvPicPr>
+                      <a:picLocks noChangeAspect="1" noChangeArrowheads="1"/>
+                    </pic:cNvPicPr>
+                  </pic:nvPicPr>
+                  <pic:blipFill>
+                    <a:blip r:embed="rId12" cstate="none"/>
+                    <a:srcRect/>
+                    <a:stretch>
+                      <a:fillRect/>
+                    </a:stretch>
+                  </pic:blipFill>
+                  <pic:spPr bwMode="auto">
+                    <a:xfrm>
+                      <a:off x="0" y="0"/>
+                      <a:ext cx="5619750" cy="2762250"/>
+                    </a:xfrm>
+                    <a:prstGeom prst="rect">
+                      <a:avLst/>
+                    </a:prstGeom>
+                  </pic:spPr>
+                </pic:pic>
+              </a:graphicData>
+            </a:graphic>
+          </wp:inline>
+        </w:drawing>
+      </w:r>
+    </w:p>
+    <w:p>
+      <w:pPr>
+        <w:spacing w:after="200" w:line="260"/>
+        <w:jc w:val="both"/>
+      </w:pPr>
+      <w:r>
+        <w:rPr>
+          <w:rFonts w:ascii="Times New Roman" w:cs="Times New Roman" w:eastAsia="Times New Roman" w:hAnsi="Times New Roman"/>
+          <w:b/>
+          <w:bCs/>
+          <w:sz w:val="18"/>
+          <w:szCs w:val="18"/>
+        </w:rPr>
+        <w:t xml:space="preserve">Figure 4. </w:t>
+      </w:r>
+      <w:r>
+        <w:rPr>
+          <w:rFonts w:ascii="Times New Roman" w:cs="Times New Roman" w:eastAsia="Times New Roman" w:hAnsi="Times New Roman"/>
+          <w:sz w:val="18"/>
+          <w:szCs w:val="18"/>
+        </w:rPr>
+        <w:t xml:space="preserve">The design-dependent dissociation between immediate output and durable learning (Bastani et al., 2025). During practice, both AI groups improved; on the subsequent AI-free examination, unguarded GPT use reduced scores by approximately 17% relative to students who never had AI, whereas a hint-only guardrailed tutor eliminated the harm. Values are indexed to the control group (= 100).</w:t>
       </w:r>
     </w:p>
     <w:p>
@@ -2426,6 +2710,77 @@
     </w:p>
     <w:p>
       <w:pPr>
+        <w:keepNext/>
+        <w:spacing w:after="40" w:before="200"/>
+        <w:jc w:val="center"/>
+      </w:pPr>
+      <w:r>
+        <w:drawing>
+          <wp:inline distT="0" distB="0" distL="0" distR="0">
+            <wp:extent cx="5619750" cy="2286000"/>
+            <wp:effectExtent t="0" r="0" b="0" l="0"/>
+            <wp:docPr id="1" name="Figure 5." descr="Key governance milestones for AI in education, 2023–2025. Sources: UNESCO (2023, 2024); European Parliament and Council of the European Union (2024)." title="Figure 5."/>
+            <wp:cNvGraphicFramePr>
+              <a:graphicFrameLocks xmlns:a="http://schemas.openxmlformats.org/drawingml/2006/main" noChangeAspect="1"/>
+            </wp:cNvGraphicFramePr>
+            <a:graphic xmlns:a="http://schemas.openxmlformats.org/drawingml/2006/main">
+              <a:graphicData uri="http://schemas.openxmlformats.org/drawingml/2006/picture">
+                <pic:pic xmlns:pic="http://schemas.openxmlformats.org/drawingml/2006/picture">
+                  <pic:nvPicPr>
+                    <pic:cNvPr id="0" name="" descr=""/>
+                    <pic:cNvPicPr>
+                      <a:picLocks noChangeAspect="1" noChangeArrowheads="1"/>
+                    </pic:cNvPicPr>
+                  </pic:nvPicPr>
+                  <pic:blipFill>
+                    <a:blip r:embed="rId13" cstate="none"/>
+                    <a:srcRect/>
+                    <a:stretch>
+                      <a:fillRect/>
+                    </a:stretch>
+                  </pic:blipFill>
+                  <pic:spPr bwMode="auto">
+                    <a:xfrm>
+                      <a:off x="0" y="0"/>
+                      <a:ext cx="5619750" cy="2286000"/>
+                    </a:xfrm>
+                    <a:prstGeom prst="rect">
+                      <a:avLst/>
+                    </a:prstGeom>
+                  </pic:spPr>
+                </pic:pic>
+              </a:graphicData>
+            </a:graphic>
+          </wp:inline>
+        </w:drawing>
+      </w:r>
+    </w:p>
+    <w:p>
+      <w:pPr>
+        <w:spacing w:after="200" w:line="260"/>
+        <w:jc w:val="both"/>
+      </w:pPr>
+      <w:r>
+        <w:rPr>
+          <w:rFonts w:ascii="Times New Roman" w:cs="Times New Roman" w:eastAsia="Times New Roman" w:hAnsi="Times New Roman"/>
+          <w:b/>
+          <w:bCs/>
+          <w:sz w:val="18"/>
+          <w:szCs w:val="18"/>
+        </w:rPr>
+        <w:t xml:space="preserve">Figure 5. </w:t>
+      </w:r>
+      <w:r>
+        <w:rPr>
+          <w:rFonts w:ascii="Times New Roman" w:cs="Times New Roman" w:eastAsia="Times New Roman" w:hAnsi="Times New Roman"/>
+          <w:sz w:val="18"/>
+          <w:szCs w:val="18"/>
+        </w:rPr>
+        <w:t xml:space="preserve">Key governance milestones for AI in education, 2023–2025. Sources: UNESCO (2023, 2024); European Parliament and Council of the European Union (2024).</w:t>
+      </w:r>
+    </w:p>
+    <w:p>
+      <w:pPr>
         <w:spacing w:after="120" w:line="360"/>
         <w:ind w:firstLine="360"/>
         <w:jc w:val="both"/>
@@ -2869,7 +3224,7 @@
         </w:rPr>
         <w:t xml:space="preserve"> [Preprint]. arXiv:2502.00289. </w:t>
       </w:r>
-      <w:hyperlink w:history="1" r:id="rIdxwmxkd4voywto36pnjcpz">
+      <w:hyperlink w:history="1" r:id="rIdsqwswc1kloj_avyi5rbu2">
         <w:r>
           <w:rPr>
             <w:rStyle w:val="Hyperlink"/>
@@ -2911,7 +3266,7 @@
         </w:rPr>
         <w:t xml:space="preserve">, Article 1738774. </w:t>
       </w:r>
-      <w:hyperlink w:history="1" r:id="rIdgdcqdyh4skp0ppkk0k6nc">
+      <w:hyperlink w:history="1" r:id="rIdgwgythfzsfsmhivmspmbb">
         <w:r>
           <w:rPr>
             <w:rStyle w:val="Hyperlink"/>
@@ -2953,7 +3308,7 @@
         </w:rPr>
         <w:t xml:space="preserve">(26), e2422633122. </w:t>
       </w:r>
-      <w:hyperlink w:history="1" r:id="rId_8zphpjr7gm6e5kynsap3">
+      <w:hyperlink w:history="1" r:id="rId7j1zod1w2pbh4tg44jfdd">
         <w:r>
           <w:rPr>
             <w:rStyle w:val="Hyperlink"/>
@@ -2995,7 +3350,7 @@
         </w:rPr>
         <w:t xml:space="preserve">(4), Article 296. </w:t>
       </w:r>
-      <w:hyperlink w:history="1" r:id="rId2ihpokzkv3zz277izpt4y">
+      <w:hyperlink w:history="1" r:id="rIdy78kmpmqfzu-gaxx7ornh">
         <w:r>
           <w:rPr>
             <w:rStyle w:val="Hyperlink"/>
@@ -3037,7 +3392,7 @@
         </w:rPr>
         <w:t xml:space="preserve">. Advance online publication. </w:t>
       </w:r>
-      <w:hyperlink w:history="1" r:id="rId32vrc7j_fmthtiegdpow1">
+      <w:hyperlink w:history="1" r:id="rIdpybnbngq36964jtlxkfxk">
         <w:r>
           <w:rPr>
             <w:rStyle w:val="Hyperlink"/>
@@ -3079,7 +3434,7 @@
         </w:rPr>
         <w:t xml:space="preserve"> (pp. 13782–13810). Association for Computational Linguistics. </w:t>
       </w:r>
-      <w:hyperlink w:history="1" r:id="rIdruqcb588oapehj7m1mbwj">
+      <w:hyperlink w:history="1" r:id="rId50dt2-mpf27jya5tdi2c2">
         <w:r>
           <w:rPr>
             <w:rStyle w:val="Hyperlink"/>
@@ -3121,7 +3476,7 @@
         </w:rPr>
         <w:t xml:space="preserve"> (Policy Research Working Paper No. 11125). World Bank. </w:t>
       </w:r>
-      <w:hyperlink w:history="1" r:id="rId7klpf_mzgc4kxi_zhawhu">
+      <w:hyperlink w:history="1" r:id="rId_tmv7bntle3sg0je8iryq">
         <w:r>
           <w:rPr>
             <w:rStyle w:val="Hyperlink"/>
@@ -3163,7 +3518,7 @@
         </w:rPr>
         <w:t xml:space="preserve">. Official Journal of the European Union, L 2024/1689. </w:t>
       </w:r>
-      <w:hyperlink w:history="1" r:id="rIdrun7zts-hm3i0pl3tniaj">
+      <w:hyperlink w:history="1" r:id="rIdnassshvziub4c9793wnsu">
         <w:r>
           <w:rPr>
             <w:rStyle w:val="Hyperlink"/>
@@ -3205,7 +3560,7 @@
         </w:rPr>
         <w:t xml:space="preserve">(2), 489–530. </w:t>
       </w:r>
-      <w:hyperlink w:history="1" r:id="rId09eios7tnonhioct9vcde">
+      <w:hyperlink w:history="1" r:id="rId7qk66atuetmmwesrzzlyh">
         <w:r>
           <w:rPr>
             <w:rStyle w:val="Hyperlink"/>
@@ -3247,7 +3602,7 @@
         </w:rPr>
         <w:t xml:space="preserve">. Georgia Tech Research News. </w:t>
       </w:r>
-      <w:hyperlink w:history="1" r:id="rIddsvb77btak-ug2f8a3fqg">
+      <w:hyperlink w:history="1" r:id="rIddkwrhut-azxc7drb4ei7w">
         <w:r>
           <w:rPr>
             <w:rStyle w:val="Hyperlink"/>
@@ -3289,7 +3644,7 @@
         </w:rPr>
         <w:t xml:space="preserve"> [Preprint]. arXiv:2603.20056. </w:t>
       </w:r>
-      <w:hyperlink w:history="1" r:id="rIdxno591z2bqdvusnxtdhip">
+      <w:hyperlink w:history="1" r:id="rIdgydoimje8o_mm0a4fc0ek">
         <w:r>
           <w:rPr>
             <w:rStyle w:val="Hyperlink"/>
@@ -3331,7 +3686,7 @@
         </w:rPr>
         <w:t xml:space="preserve">. Advance online publication. </w:t>
       </w:r>
-      <w:hyperlink w:history="1" r:id="rIdbruyjzrwmckqu0mtpty7j">
+      <w:hyperlink w:history="1" r:id="rIdyhze1fdu7gv02fga0lba-">
         <w:r>
           <w:rPr>
             <w:rStyle w:val="Hyperlink"/>
@@ -3373,7 +3728,7 @@
         </w:rPr>
         <w:t xml:space="preserve"> [Preprint]. arXiv:2504.20082. </w:t>
       </w:r>
-      <w:hyperlink w:history="1" r:id="rId6pr4721_rnobdqe7bc1zj">
+      <w:hyperlink w:history="1" r:id="rIdu7xh1hnx5zupp2xfrhjwz">
         <w:r>
           <w:rPr>
             <w:rStyle w:val="Hyperlink"/>
@@ -3415,7 +3770,7 @@
         </w:rPr>
         <w:t xml:space="preserve">, Article 17458. </w:t>
       </w:r>
-      <w:hyperlink w:history="1" r:id="rIdusrvcnmqhhyelgk1ctswr">
+      <w:hyperlink w:history="1" r:id="rIdcvmbn31jagwrcldfrlbyx">
         <w:r>
           <w:rPr>
             <w:rStyle w:val="Hyperlink"/>
@@ -3457,7 +3812,7 @@
         </w:rPr>
         <w:t xml:space="preserve"> [Preprint]. arXiv:2506.08872. </w:t>
       </w:r>
-      <w:hyperlink w:history="1" r:id="rId8xtpoyijmvj8pvawav4yo">
+      <w:hyperlink w:history="1" r:id="rIdexdaatkw8fdexgemh390q">
         <w:r>
           <w:rPr>
             <w:rStyle w:val="Hyperlink"/>
@@ -3499,7 +3854,7 @@
         </w:rPr>
         <w:t xml:space="preserve"> [Preprint]. arXiv:2506.12469. </w:t>
       </w:r>
-      <w:hyperlink w:history="1" r:id="rIdl5wc97w5t9c1649ei5bem">
+      <w:hyperlink w:history="1" r:id="rIdkdvwegl7kazv-fzhjesr9">
         <w:r>
           <w:rPr>
             <w:rStyle w:val="Hyperlink"/>
@@ -3541,7 +3896,7 @@
         </w:rPr>
         <w:t xml:space="preserve"> [Preprint]. arXiv:2601.06818. </w:t>
       </w:r>
-      <w:hyperlink w:history="1" r:id="rIdplnb_8wtjdppjnrfvkaml">
+      <w:hyperlink w:history="1" r:id="rId5sayvhzrhxgebkc8of0ek">
         <w:r>
           <w:rPr>
             <w:rStyle w:val="Hyperlink"/>
@@ -3583,7 +3938,7 @@
         </w:rPr>
         <w:t xml:space="preserve">(4), e70096. </w:t>
       </w:r>
-      <w:hyperlink w:history="1" r:id="rId3vbqjy4p_gzsbifnouqxj">
+      <w:hyperlink w:history="1" r:id="rId_hpdtycwc3xbnjehk8dj3">
         <w:r>
           <w:rPr>
             <w:rStyle w:val="Hyperlink"/>
@@ -3625,7 +3980,7 @@
         </w:rPr>
         <w:t xml:space="preserve">, Article 1729059. </w:t>
       </w:r>
-      <w:hyperlink w:history="1" r:id="rIduw813kv53t7hh-sejtxkv">
+      <w:hyperlink w:history="1" r:id="rId7ls5aljgcszfbbk9ca-lz">
         <w:r>
           <w:rPr>
             <w:rStyle w:val="Hyperlink"/>
@@ -3667,7 +4022,7 @@
         </w:rPr>
         <w:t xml:space="preserve">, Article 1759027. </w:t>
       </w:r>
-      <w:hyperlink w:history="1" r:id="rIdu16wv9puxkaon8ttu63-c">
+      <w:hyperlink w:history="1" r:id="rIdkaivp4iuncx1wiiq3w6zt">
         <w:r>
           <w:rPr>
             <w:rStyle w:val="Hyperlink"/>
@@ -3709,7 +4064,7 @@
         </w:rPr>
         <w:t xml:space="preserve">. OECD Publishing. </w:t>
       </w:r>
-      <w:hyperlink w:history="1" r:id="rIdhotjylmnlvvi0xdct4paz">
+      <w:hyperlink w:history="1" r:id="rIdagoamtawvzjeeko69hvhd">
         <w:r>
           <w:rPr>
             <w:rStyle w:val="Hyperlink"/>
@@ -3751,7 +4106,7 @@
         </w:rPr>
         <w:t xml:space="preserve"> [Preprint]. arXiv:2509.14803. </w:t>
       </w:r>
-      <w:hyperlink w:history="1" r:id="rIdjrh3lugfkt7suoivluxfj">
+      <w:hyperlink w:history="1" r:id="rIddq9_hrqij35xmhm687f5b">
         <w:r>
           <w:rPr>
             <w:rStyle w:val="Hyperlink"/>
@@ -3793,7 +4148,7 @@
         </w:rPr>
         <w:t xml:space="preserve">(1). </w:t>
       </w:r>
-      <w:hyperlink w:history="1" r:id="rIdoiusu7tywyc2thdgqikym">
+      <w:hyperlink w:history="1" r:id="rId02fs0drpkn64l6pyrdgse">
         <w:r>
           <w:rPr>
             <w:rStyle w:val="Hyperlink"/>
@@ -3835,7 +4190,7 @@
         </w:rPr>
         <w:t xml:space="preserve">, Article 103599. </w:t>
       </w:r>
-      <w:hyperlink w:history="1" r:id="rIdnoeg_m_iafqofm1nt9qbl">
+      <w:hyperlink w:history="1" r:id="rIdrgp__frww9mq236h_vfqb">
         <w:r>
           <w:rPr>
             <w:rStyle w:val="Hyperlink"/>
@@ -3877,7 +4232,7 @@
         </w:rPr>
         <w:t xml:space="preserve"> [Preprint]. arXiv:2602.17671. </w:t>
       </w:r>
-      <w:hyperlink w:history="1" r:id="rId0d5lunh-t59pex6x2y3mc">
+      <w:hyperlink w:history="1" r:id="rId6rekttewtwqrpjtimyk7i">
         <w:r>
           <w:rPr>
             <w:rStyle w:val="Hyperlink"/>
@@ -3919,7 +4274,7 @@
         </w:rPr>
         <w:t xml:space="preserve">(4), 155–178. </w:t>
       </w:r>
-      <w:hyperlink w:history="1" r:id="rIdurvde24s19070rj3amxqc">
+      <w:hyperlink w:history="1" r:id="rId4dayvrwq8rnviyuihade-">
         <w:r>
           <w:rPr>
             <w:rStyle w:val="Hyperlink"/>
@@ -3961,7 +4316,7 @@
         </w:rPr>
         <w:t xml:space="preserve"> [Preprint]. arXiv:2508.16659. </w:t>
       </w:r>
-      <w:hyperlink w:history="1" r:id="rIdqcj0laiu9sp-wm4ywxawc">
+      <w:hyperlink w:history="1" r:id="rId5n7_n0rkqy4vjo2frqnw1">
         <w:r>
           <w:rPr>
             <w:rStyle w:val="Hyperlink"/>
@@ -4003,7 +4358,7 @@
         </w:rPr>
         <w:t xml:space="preserve"> [Preprint]. arXiv:2510.03884. </w:t>
       </w:r>
-      <w:hyperlink w:history="1" r:id="rId-0wclb_otdy5f4jms4guw">
+      <w:hyperlink w:history="1" r:id="rIditguuplsnacoxoox4og8b">
         <w:r>
           <w:rPr>
             <w:rStyle w:val="Hyperlink"/>
@@ -4045,7 +4400,7 @@
         </w:rPr>
         <w:t xml:space="preserve"> (F. Miao &amp; W. Holmes, Authors). </w:t>
       </w:r>
-      <w:hyperlink w:history="1" r:id="rIdztkmqahmhytlr4slbpi6s">
+      <w:hyperlink w:history="1" r:id="rIdwfwnzd_4flkoay2p-0dnb">
         <w:r>
           <w:rPr>
             <w:rStyle w:val="Hyperlink"/>
@@ -4087,7 +4442,7 @@
         </w:rPr>
         <w:t xml:space="preserve">. </w:t>
       </w:r>
-      <w:hyperlink w:history="1" r:id="rIds-hyd1sk0men8ljbo7qwx">
+      <w:hyperlink w:history="1" r:id="rIdpyluiu9txkwzdslivhnro">
         <w:r>
           <w:rPr>
             <w:rStyle w:val="Hyperlink"/>
@@ -4129,7 +4484,7 @@
         </w:rPr>
         <w:t xml:space="preserve">. Retrieved 2026, from </w:t>
       </w:r>
-      <w:hyperlink w:history="1" r:id="rIddgzgtgoacphh901iwciab">
+      <w:hyperlink w:history="1" r:id="rId-ayal_uy43m7palfjglvd">
         <w:r>
           <w:rPr>
             <w:rStyle w:val="Hyperlink"/>
@@ -4171,7 +4526,7 @@
         </w:rPr>
         <w:t xml:space="preserve">(1). </w:t>
       </w:r>
-      <w:hyperlink w:history="1" r:id="rId2peijweluebih8hie78jd">
+      <w:hyperlink w:history="1" r:id="rIdw0sypefddyrnwvozilunl">
         <w:r>
           <w:rPr>
             <w:rStyle w:val="Hyperlink"/>
@@ -4213,7 +4568,7 @@
         </w:rPr>
         <w:t xml:space="preserve"> [Preprint]. arXiv:2508.14825. </w:t>
       </w:r>
-      <w:hyperlink w:history="1" r:id="rIdje3rvtzp-j4a1rivq3chl">
+      <w:hyperlink w:history="1" r:id="rId1h7arobd5cpd8p64-ptah">
         <w:r>
           <w:rPr>
             <w:rStyle w:val="Hyperlink"/>
@@ -4255,7 +4610,7 @@
         </w:rPr>
         <w:t xml:space="preserve">, Article 525. </w:t>
       </w:r>
-      <w:hyperlink w:history="1" r:id="rIdfwvy8q40jeibowyyks2ry">
+      <w:hyperlink w:history="1" r:id="rIdc9x1yjs0m26axcwmjfglt">
         <w:r>
           <w:rPr>
             <w:rStyle w:val="Hyperlink"/>
@@ -4297,7 +4652,7 @@
         </w:rPr>
         <w:t xml:space="preserve">(4), 1068–1092. </w:t>
       </w:r>
-      <w:hyperlink w:history="1" r:id="rIdmsyqhkrm8pful0qly9vlb">
+      <w:hyperlink w:history="1" r:id="rId5jnwe4s0ouc7bs7acxq4v">
         <w:r>
           <w:rPr>
             <w:rStyle w:val="Hyperlink"/>
@@ -4339,7 +4694,7 @@
         </w:rPr>
         <w:t xml:space="preserve">(1), Article 1306. </w:t>
       </w:r>
-      <w:hyperlink w:history="1" r:id="rIdijpyqk9yhqx0ks68qq8g2">
+      <w:hyperlink w:history="1" r:id="rIdjbfqdm5fvykiss1r_mjzw">
         <w:r>
           <w:rPr>
             <w:rStyle w:val="Hyperlink"/>

</xml_diff>

<commit_message>
Remove retracted meta-analysis entirely
Per author preference, fully excise the retracted Wang & Fan (2025) paper
and its retraction note to safeguard scholarly integrity:
- Dropped both reference entries (now 34 refs)
- Removed the retracted marker from the forest plot (Figure 3)
- Rewrote section 5.2 around effect-size heterogeneity using only
  non-retracted sources (Cheng et al. 2026; Liu et al. 2025)
- Cleaned abstract and discussion of retraction references
Verified zero retraction-related mentions remain; no dangling citations.

https://claude.ai/code/session_01YW6bjEw6DSrD5H7JmH8dwe
</commit_message>
<xml_diff>
--- a/Agentic-AI-in-Education-Narrative-Review.docx
+++ b/Agentic-AI-in-Education-Narrative-Review.docx
@@ -189,7 +189,7 @@
           <w:sz w:val="20"/>
           <w:szCs w:val="20"/>
         </w:rPr>
-        <w:t xml:space="preserve">Responsible adoption depends on guardrailed, human-in-the-loop, teacher-mediated design. The evidence base remains young, heterogeneous, and quality-variable—underscored by a 2026 meta-analysis retraction—indicating an urgent need for longitudinal evidence and education-specific accountability frameworks. </w:t>
+        <w:t xml:space="preserve">Responsible adoption depends on guardrailed, human-in-the-loop, teacher-mediated design. The evidence base remains young, heterogeneous, and quality-variable, indicating an urgent need for longitudinal evidence and education-specific accountability frameworks. </w:t>
       </w:r>
     </w:p>
     <w:p>
@@ -1967,9 +1967,9 @@
       <w:r>
         <w:drawing>
           <wp:inline distT="0" distB="0" distL="0" distR="0">
-            <wp:extent cx="5619750" cy="2352675"/>
+            <wp:extent cx="5619750" cy="2095500"/>
             <wp:effectExtent t="0" r="0" b="0" l="0"/>
-            <wp:docPr id="1" name="Figure 3." descr="Reported standardized effect sizes for AI and generative-AI on learning outcomes. Metrics, comparators, and contexts differ across studies and are not directly poolable; values are shown for orientation only. Whiskers denote the 95% confidence interval (Liu et al., 2025) or the authors’ reported range (Kestin et al., 2025). The retracted estimate (Wang &amp; Fan, 2025) is included solely as a cautionary marker. Sources: Liu et al. (2025); Kestin et al. (2025); Cheng et al. (2026); De Simone et al. (2025)." title="Figure 3."/>
+            <wp:docPr id="1" name="Figure 3." descr="Reported standardized effect sizes for AI and generative-AI on learning outcomes. Metrics, comparators, and contexts differ across studies and are not directly poolable; values are shown for orientation only. Whiskers denote the 95% confidence interval (Liu et al., 2025) or the authors’ reported range (Kestin et al., 2025). Sources: Liu et al. (2025); Kestin et al. (2025); Cheng et al. (2026); De Simone et al. (2025)." title="Figure 3."/>
             <wp:cNvGraphicFramePr>
               <a:graphicFrameLocks xmlns:a="http://schemas.openxmlformats.org/drawingml/2006/main" noChangeAspect="1"/>
             </wp:cNvGraphicFramePr>
@@ -1992,7 +1992,7 @@
                   <pic:spPr bwMode="auto">
                     <a:xfrm>
                       <a:off x="0" y="0"/>
-                      <a:ext cx="5619750" cy="2352675"/>
+                      <a:ext cx="5619750" cy="2095500"/>
                     </a:xfrm>
                     <a:prstGeom prst="rect">
                       <a:avLst/>
@@ -2026,7 +2026,7 @@
           <w:sz w:val="18"/>
           <w:szCs w:val="18"/>
         </w:rPr>
-        <w:t xml:space="preserve">Reported standardized effect sizes for AI and generative-AI on learning outcomes. Metrics, comparators, and contexts differ across studies and are not directly poolable; values are shown for orientation only. Whiskers denote the 95% confidence interval (Liu et al., 2025) or the authors’ reported range (Kestin et al., 2025). The retracted estimate (Wang &amp; Fan, 2025) is included solely as a cautionary marker. Sources: Liu et al. (2025); Kestin et al. (2025); Cheng et al. (2026); De Simone et al. (2025).</w:t>
+        <w:t xml:space="preserve">Reported standardized effect sizes for AI and generative-AI on learning outcomes. Metrics, comparators, and contexts differ across studies and are not directly poolable; values are shown for orientation only. Whiskers denote the 95% confidence interval (Liu et al., 2025) or the authors’ reported range (Kestin et al., 2025). Sources: Liu et al. (2025); Kestin et al. (2025); Cheng et al. (2026); De Simone et al. (2025).</w:t>
       </w:r>
     </w:p>
     <w:p>
@@ -2146,7 +2146,7 @@
           <w:sz w:val="24"/>
           <w:szCs w:val="24"/>
         </w:rPr>
-        <w:t xml:space="preserve">5.2 Evidence quality and a cautionary retraction</w:t>
+        <w:t xml:space="preserve">5.2 Evidence quality and effect-size heterogeneity</w:t>
       </w:r>
     </w:p>
     <w:p>
@@ -2159,7 +2159,7 @@
         <w:rPr>
           <w:rFonts w:ascii="Times New Roman" w:cs="Times New Roman" w:eastAsia="Times New Roman" w:hAnsi="Times New Roman"/>
         </w:rPr>
-        <w:t xml:space="preserve">Pooled effect sizes for generative AI in education range widely (g ≈ 0.46 to 1.14) across 2025–2026 meta-analyses, signalling heterogeneous, short-term, and frequently low-rigour primary studies alongside probable publication bias. Most strikingly, a heavily cited meta-analysis (Wang &amp; Fan, 2025, retracted; originally reporting g = 0.867) was retracted in 2026 for data discrepancies after several hundred citations and approximately half a million reads (Retraction note, 2026). Accordingly, the conservative peer-reviewed estimate (Liu et al., 2025; g ≈ 0.58) should be preferred, and effects reported as a range rather than a point value.</w:t>
+        <w:t xml:space="preserve">Pooled effect sizes for generative AI in education range widely across 2025–2026 meta-analyses—from g ≈ 0.40 (Cheng et al., 2026) and g ≈ 0.58 (Liu et al., 2025) to substantially larger estimates—signalling heterogeneous, often short-term, and frequently low-rigour primary studies alongside probable publication bias. This dispersion is compounded by inconsistent comparators (business-as-usual instruction, active learning, or alternative tools), brief intervention windows, and variable outcome measures. Accordingly, the more conservative peer-reviewed estimates should be preferred over headline figures, and effects reported as a range bounded by the conditions of use rather than as a single point value.</w:t>
       </w:r>
     </w:p>
     <w:p>
@@ -3031,7 +3031,7 @@
         <w:rPr>
           <w:rFonts w:ascii="Times New Roman" w:cs="Times New Roman" w:eastAsia="Times New Roman" w:hAnsi="Times New Roman"/>
         </w:rPr>
-        <w:t xml:space="preserve">On governance (RQ3), the central finding is structural lag: today’s strongest instruments were written for an earlier, less autonomous generation of AI, leaving accountability for action-taking agents underdetermined. This lag interacts with an evidence base young enough that even its meta-analyses are being retracted, and with equity dynamics that risk widening rather than narrowing attainment gaps. The practical implication is convergent across the literature: adoption should be guardrailed, human-in-the-loop, and teacher-mediated, with autonomy deliberately throttled below technical capability where stakes are high.</w:t>
+        <w:t xml:space="preserve">On governance (RQ3), the central finding is structural lag: today’s strongest instruments were written for an earlier, less autonomous generation of AI, leaving accountability for action-taking agents underdetermined. This lag interacts with an evidence base that is young, heterogeneous, and methodologically uneven, and with equity dynamics that risk widening rather than narrowing attainment gaps. The practical implication is convergent across the literature: adoption should be guardrailed, human-in-the-loop, and teacher-mediated, with autonomy deliberately throttled below technical capability where stakes are high.</w:t>
       </w:r>
     </w:p>
     <w:p>
@@ -3224,7 +3224,7 @@
         </w:rPr>
         <w:t xml:space="preserve"> [Preprint]. arXiv:2502.00289. </w:t>
       </w:r>
-      <w:hyperlink w:history="1" r:id="rIdsqwswc1kloj_avyi5rbu2">
+      <w:hyperlink w:history="1" r:id="rIdzjeyalsrcciqhyqe_1mi8">
         <w:r>
           <w:rPr>
             <w:rStyle w:val="Hyperlink"/>
@@ -3266,7 +3266,7 @@
         </w:rPr>
         <w:t xml:space="preserve">, Article 1738774. </w:t>
       </w:r>
-      <w:hyperlink w:history="1" r:id="rIdgwgythfzsfsmhivmspmbb">
+      <w:hyperlink w:history="1" r:id="rId7puler2ewczsbh4sagi7g">
         <w:r>
           <w:rPr>
             <w:rStyle w:val="Hyperlink"/>
@@ -3308,7 +3308,7 @@
         </w:rPr>
         <w:t xml:space="preserve">(26), e2422633122. </w:t>
       </w:r>
-      <w:hyperlink w:history="1" r:id="rId7j1zod1w2pbh4tg44jfdd">
+      <w:hyperlink w:history="1" r:id="rIdcbflyhkatc5pxd_yp4iem">
         <w:r>
           <w:rPr>
             <w:rStyle w:val="Hyperlink"/>
@@ -3350,7 +3350,7 @@
         </w:rPr>
         <w:t xml:space="preserve">(4), Article 296. </w:t>
       </w:r>
-      <w:hyperlink w:history="1" r:id="rIdy78kmpmqfzu-gaxx7ornh">
+      <w:hyperlink w:history="1" r:id="rIdnjevqar2tkxmqeobqifk5">
         <w:r>
           <w:rPr>
             <w:rStyle w:val="Hyperlink"/>
@@ -3392,7 +3392,7 @@
         </w:rPr>
         <w:t xml:space="preserve">. Advance online publication. </w:t>
       </w:r>
-      <w:hyperlink w:history="1" r:id="rIdpybnbngq36964jtlxkfxk">
+      <w:hyperlink w:history="1" r:id="rIdllnrzw5kxvijkep3pvus9">
         <w:r>
           <w:rPr>
             <w:rStyle w:val="Hyperlink"/>
@@ -3434,7 +3434,7 @@
         </w:rPr>
         <w:t xml:space="preserve"> (pp. 13782–13810). Association for Computational Linguistics. </w:t>
       </w:r>
-      <w:hyperlink w:history="1" r:id="rId50dt2-mpf27jya5tdi2c2">
+      <w:hyperlink w:history="1" r:id="rIdvf_dfiuerdiycrty_pagq">
         <w:r>
           <w:rPr>
             <w:rStyle w:val="Hyperlink"/>
@@ -3476,7 +3476,7 @@
         </w:rPr>
         <w:t xml:space="preserve"> (Policy Research Working Paper No. 11125). World Bank. </w:t>
       </w:r>
-      <w:hyperlink w:history="1" r:id="rId_tmv7bntle3sg0je8iryq">
+      <w:hyperlink w:history="1" r:id="rIdl5umpbjkru1swtrwmtcl1">
         <w:r>
           <w:rPr>
             <w:rStyle w:val="Hyperlink"/>
@@ -3518,7 +3518,7 @@
         </w:rPr>
         <w:t xml:space="preserve">. Official Journal of the European Union, L 2024/1689. </w:t>
       </w:r>
-      <w:hyperlink w:history="1" r:id="rIdnassshvziub4c9793wnsu">
+      <w:hyperlink w:history="1" r:id="rIddjfr4ddtdaxdsdrkksuol">
         <w:r>
           <w:rPr>
             <w:rStyle w:val="Hyperlink"/>
@@ -3560,7 +3560,7 @@
         </w:rPr>
         <w:t xml:space="preserve">(2), 489–530. </w:t>
       </w:r>
-      <w:hyperlink w:history="1" r:id="rId7qk66atuetmmwesrzzlyh">
+      <w:hyperlink w:history="1" r:id="rIdldylte9kdivjibeapv09e">
         <w:r>
           <w:rPr>
             <w:rStyle w:val="Hyperlink"/>
@@ -3602,7 +3602,7 @@
         </w:rPr>
         <w:t xml:space="preserve">. Georgia Tech Research News. </w:t>
       </w:r>
-      <w:hyperlink w:history="1" r:id="rIddkwrhut-azxc7drb4ei7w">
+      <w:hyperlink w:history="1" r:id="rIdip1s3vsi4cxo7fauh_5f9">
         <w:r>
           <w:rPr>
             <w:rStyle w:val="Hyperlink"/>
@@ -3644,7 +3644,7 @@
         </w:rPr>
         <w:t xml:space="preserve"> [Preprint]. arXiv:2603.20056. </w:t>
       </w:r>
-      <w:hyperlink w:history="1" r:id="rIdgydoimje8o_mm0a4fc0ek">
+      <w:hyperlink w:history="1" r:id="rIdxtkz1jpfir4wpqbyaqr0z">
         <w:r>
           <w:rPr>
             <w:rStyle w:val="Hyperlink"/>
@@ -3686,7 +3686,7 @@
         </w:rPr>
         <w:t xml:space="preserve">. Advance online publication. </w:t>
       </w:r>
-      <w:hyperlink w:history="1" r:id="rIdyhze1fdu7gv02fga0lba-">
+      <w:hyperlink w:history="1" r:id="rIdgmzjhnifbdtb4s-oc2t_8">
         <w:r>
           <w:rPr>
             <w:rStyle w:val="Hyperlink"/>
@@ -3728,7 +3728,7 @@
         </w:rPr>
         <w:t xml:space="preserve"> [Preprint]. arXiv:2504.20082. </w:t>
       </w:r>
-      <w:hyperlink w:history="1" r:id="rIdu7xh1hnx5zupp2xfrhjwz">
+      <w:hyperlink w:history="1" r:id="rIdes4j5ad6wt3g4rkapb4t2">
         <w:r>
           <w:rPr>
             <w:rStyle w:val="Hyperlink"/>
@@ -3770,7 +3770,7 @@
         </w:rPr>
         <w:t xml:space="preserve">, Article 17458. </w:t>
       </w:r>
-      <w:hyperlink w:history="1" r:id="rIdcvmbn31jagwrcldfrlbyx">
+      <w:hyperlink w:history="1" r:id="rIdq0j-ga4ef3ns0lgrpdfq9">
         <w:r>
           <w:rPr>
             <w:rStyle w:val="Hyperlink"/>
@@ -3812,7 +3812,7 @@
         </w:rPr>
         <w:t xml:space="preserve"> [Preprint]. arXiv:2506.08872. </w:t>
       </w:r>
-      <w:hyperlink w:history="1" r:id="rIdexdaatkw8fdexgemh390q">
+      <w:hyperlink w:history="1" r:id="rId81agjpgqkwomc00y8rj2f">
         <w:r>
           <w:rPr>
             <w:rStyle w:val="Hyperlink"/>
@@ -3854,7 +3854,7 @@
         </w:rPr>
         <w:t xml:space="preserve"> [Preprint]. arXiv:2506.12469. </w:t>
       </w:r>
-      <w:hyperlink w:history="1" r:id="rIdkdvwegl7kazv-fzhjesr9">
+      <w:hyperlink w:history="1" r:id="rIdqhc60etmll8xe6mv8epyl">
         <w:r>
           <w:rPr>
             <w:rStyle w:val="Hyperlink"/>
@@ -3896,7 +3896,7 @@
         </w:rPr>
         <w:t xml:space="preserve"> [Preprint]. arXiv:2601.06818. </w:t>
       </w:r>
-      <w:hyperlink w:history="1" r:id="rId5sayvhzrhxgebkc8of0ek">
+      <w:hyperlink w:history="1" r:id="rId5shpi7vwcslczqxslptgn">
         <w:r>
           <w:rPr>
             <w:rStyle w:val="Hyperlink"/>
@@ -3938,7 +3938,7 @@
         </w:rPr>
         <w:t xml:space="preserve">(4), e70096. </w:t>
       </w:r>
-      <w:hyperlink w:history="1" r:id="rId_hpdtycwc3xbnjehk8dj3">
+      <w:hyperlink w:history="1" r:id="rIdcr2vur1x00cgwmeefsskg">
         <w:r>
           <w:rPr>
             <w:rStyle w:val="Hyperlink"/>
@@ -3980,7 +3980,7 @@
         </w:rPr>
         <w:t xml:space="preserve">, Article 1729059. </w:t>
       </w:r>
-      <w:hyperlink w:history="1" r:id="rId7ls5aljgcszfbbk9ca-lz">
+      <w:hyperlink w:history="1" r:id="rIdfak1yj4su459yton7idhh">
         <w:r>
           <w:rPr>
             <w:rStyle w:val="Hyperlink"/>
@@ -4022,7 +4022,7 @@
         </w:rPr>
         <w:t xml:space="preserve">, Article 1759027. </w:t>
       </w:r>
-      <w:hyperlink w:history="1" r:id="rIdkaivp4iuncx1wiiq3w6zt">
+      <w:hyperlink w:history="1" r:id="rIds4yresemc4oabng0aokr3">
         <w:r>
           <w:rPr>
             <w:rStyle w:val="Hyperlink"/>
@@ -4064,7 +4064,7 @@
         </w:rPr>
         <w:t xml:space="preserve">. OECD Publishing. </w:t>
       </w:r>
-      <w:hyperlink w:history="1" r:id="rIdagoamtawvzjeeko69hvhd">
+      <w:hyperlink w:history="1" r:id="rIdf72ohlo7qkdhyvtwwzaro">
         <w:r>
           <w:rPr>
             <w:rStyle w:val="Hyperlink"/>
@@ -4106,7 +4106,7 @@
         </w:rPr>
         <w:t xml:space="preserve"> [Preprint]. arXiv:2509.14803. </w:t>
       </w:r>
-      <w:hyperlink w:history="1" r:id="rIddq9_hrqij35xmhm687f5b">
+      <w:hyperlink w:history="1" r:id="rId5vzzjpmnv_ncpryhtxfcv">
         <w:r>
           <w:rPr>
             <w:rStyle w:val="Hyperlink"/>
@@ -4128,48 +4128,6 @@
           <w:sz w:val="20"/>
           <w:szCs w:val="20"/>
         </w:rPr>
-        <w:t xml:space="preserve">Retraction note: The effect of ChatGPT on students’ learning performance, learning perception, and higher-order thinking. (2026). </w:t>
-      </w:r>
-      <w:r>
-        <w:rPr>
-          <w:rFonts w:ascii="Times New Roman" w:cs="Times New Roman" w:eastAsia="Times New Roman" w:hAnsi="Times New Roman"/>
-          <w:i/>
-          <w:iCs/>
-          <w:sz w:val="20"/>
-          <w:szCs w:val="20"/>
-        </w:rPr>
-        <w:t xml:space="preserve">Humanities and Social Sciences Communications, 13</w:t>
-      </w:r>
-      <w:r>
-        <w:rPr>
-          <w:rFonts w:ascii="Times New Roman" w:cs="Times New Roman" w:eastAsia="Times New Roman" w:hAnsi="Times New Roman"/>
-          <w:sz w:val="20"/>
-          <w:szCs w:val="20"/>
-        </w:rPr>
-        <w:t xml:space="preserve">(1). </w:t>
-      </w:r>
-      <w:hyperlink w:history="1" r:id="rId02fs0drpkn64l6pyrdgse">
-        <w:r>
-          <w:rPr>
-            <w:rStyle w:val="Hyperlink"/>
-            <w:rFonts w:ascii="Times New Roman" w:cs="Times New Roman" w:eastAsia="Times New Roman" w:hAnsi="Times New Roman"/>
-          </w:rPr>
-          <w:t xml:space="preserve">https://doi.org/10.1057/s41599-026-07310-z</w:t>
-        </w:r>
-      </w:hyperlink>
-    </w:p>
-    <w:p>
-      <w:pPr>
-        <w:spacing w:after="100" w:line="300"/>
-        <w:ind w:left="720" w:hanging="720"/>
-        <w:jc w:val="left"/>
-      </w:pPr>
-      <w:r>
-        <w:rPr>
-          <w:rFonts w:ascii="Times New Roman" w:cs="Times New Roman" w:eastAsia="Times New Roman" w:hAnsi="Times New Roman"/>
-          <w:sz w:val="20"/>
-          <w:szCs w:val="20"/>
-        </w:rPr>
         <w:t xml:space="preserve">Sapkota, R., Roumeliotis, K. I., &amp; Karkee, M. (2025). AI agents vs. agentic AI: A conceptual taxonomy, applications and challenges. </w:t>
       </w:r>
       <w:r>
@@ -4190,7 +4148,7 @@
         </w:rPr>
         <w:t xml:space="preserve">, Article 103599. </w:t>
       </w:r>
-      <w:hyperlink w:history="1" r:id="rIdrgp__frww9mq236h_vfqb">
+      <w:hyperlink w:history="1" r:id="rId5_jibtrh9s95w-eyzuxua">
         <w:r>
           <w:rPr>
             <w:rStyle w:val="Hyperlink"/>
@@ -4232,7 +4190,7 @@
         </w:rPr>
         <w:t xml:space="preserve"> [Preprint]. arXiv:2602.17671. </w:t>
       </w:r>
-      <w:hyperlink w:history="1" r:id="rId6rekttewtwqrpjtimyk7i">
+      <w:hyperlink w:history="1" r:id="rId9asqyajukcg19idmeqdhq">
         <w:r>
           <w:rPr>
             <w:rStyle w:val="Hyperlink"/>
@@ -4274,7 +4232,7 @@
         </w:rPr>
         <w:t xml:space="preserve">(4), 155–178. </w:t>
       </w:r>
-      <w:hyperlink w:history="1" r:id="rId4dayvrwq8rnviyuihade-">
+      <w:hyperlink w:history="1" r:id="rIdtupxpsjdh98w5gghi2vbi">
         <w:r>
           <w:rPr>
             <w:rStyle w:val="Hyperlink"/>
@@ -4316,7 +4274,7 @@
         </w:rPr>
         <w:t xml:space="preserve"> [Preprint]. arXiv:2508.16659. </w:t>
       </w:r>
-      <w:hyperlink w:history="1" r:id="rId5n7_n0rkqy4vjo2frqnw1">
+      <w:hyperlink w:history="1" r:id="rIdg0kazcvp1oakxjgqyszjq">
         <w:r>
           <w:rPr>
             <w:rStyle w:val="Hyperlink"/>
@@ -4358,7 +4316,7 @@
         </w:rPr>
         <w:t xml:space="preserve"> [Preprint]. arXiv:2510.03884. </w:t>
       </w:r>
-      <w:hyperlink w:history="1" r:id="rIditguuplsnacoxoox4og8b">
+      <w:hyperlink w:history="1" r:id="rIdcpcpce0assktfpszm5o7r">
         <w:r>
           <w:rPr>
             <w:rStyle w:val="Hyperlink"/>
@@ -4400,7 +4358,7 @@
         </w:rPr>
         <w:t xml:space="preserve"> (F. Miao &amp; W. Holmes, Authors). </w:t>
       </w:r>
-      <w:hyperlink w:history="1" r:id="rIdwfwnzd_4flkoay2p-0dnb">
+      <w:hyperlink w:history="1" r:id="rIdccasqtqzwhpopcafoqvml">
         <w:r>
           <w:rPr>
             <w:rStyle w:val="Hyperlink"/>
@@ -4442,7 +4400,7 @@
         </w:rPr>
         <w:t xml:space="preserve">. </w:t>
       </w:r>
-      <w:hyperlink w:history="1" r:id="rIdpyluiu9txkwzdslivhnro">
+      <w:hyperlink w:history="1" r:id="rIdz6b0zweeehohl-7trtsza">
         <w:r>
           <w:rPr>
             <w:rStyle w:val="Hyperlink"/>
@@ -4484,7 +4442,7 @@
         </w:rPr>
         <w:t xml:space="preserve">. Retrieved 2026, from </w:t>
       </w:r>
-      <w:hyperlink w:history="1" r:id="rId-ayal_uy43m7palfjglvd">
+      <w:hyperlink w:history="1" r:id="rIdxvdj7p5qs8wumrjsu4cwm">
         <w:r>
           <w:rPr>
             <w:rStyle w:val="Hyperlink"/>
@@ -4506,48 +4464,6 @@
           <w:sz w:val="20"/>
           <w:szCs w:val="20"/>
         </w:rPr>
-        <w:t xml:space="preserve">Wang, J., &amp; Fan, W. (2025). The effect of ChatGPT on students’ learning performance, learning perception, and higher-order thinking: Insights from a meta-analysis [Retracted]. </w:t>
-      </w:r>
-      <w:r>
-        <w:rPr>
-          <w:rFonts w:ascii="Times New Roman" w:cs="Times New Roman" w:eastAsia="Times New Roman" w:hAnsi="Times New Roman"/>
-          <w:i/>
-          <w:iCs/>
-          <w:sz w:val="20"/>
-          <w:szCs w:val="20"/>
-        </w:rPr>
-        <w:t xml:space="preserve">Humanities and Social Sciences Communications, 12</w:t>
-      </w:r>
-      <w:r>
-        <w:rPr>
-          <w:rFonts w:ascii="Times New Roman" w:cs="Times New Roman" w:eastAsia="Times New Roman" w:hAnsi="Times New Roman"/>
-          <w:sz w:val="20"/>
-          <w:szCs w:val="20"/>
-        </w:rPr>
-        <w:t xml:space="preserve">(1). </w:t>
-      </w:r>
-      <w:hyperlink w:history="1" r:id="rIdw0sypefddyrnwvozilunl">
-        <w:r>
-          <w:rPr>
-            <w:rStyle w:val="Hyperlink"/>
-            <w:rFonts w:ascii="Times New Roman" w:cs="Times New Roman" w:eastAsia="Times New Roman" w:hAnsi="Times New Roman"/>
-          </w:rPr>
-          <w:t xml:space="preserve">https://doi.org/10.1057/s41599-025-04787-y</w:t>
-        </w:r>
-      </w:hyperlink>
-    </w:p>
-    <w:p>
-      <w:pPr>
-        <w:spacing w:after="100" w:line="300"/>
-        <w:ind w:left="720" w:hanging="720"/>
-        <w:jc w:val="left"/>
-      </w:pPr>
-      <w:r>
-        <w:rPr>
-          <w:rFonts w:ascii="Times New Roman" w:cs="Times New Roman" w:eastAsia="Times New Roman" w:hAnsi="Times New Roman"/>
-          <w:sz w:val="20"/>
-          <w:szCs w:val="20"/>
-        </w:rPr>
         <w:t xml:space="preserve">Yan, L. (2025). </w:t>
       </w:r>
       <w:r>
@@ -4568,7 +4484,7 @@
         </w:rPr>
         <w:t xml:space="preserve"> [Preprint]. arXiv:2508.14825. </w:t>
       </w:r>
-      <w:hyperlink w:history="1" r:id="rId1h7arobd5cpd8p64-ptah">
+      <w:hyperlink w:history="1" r:id="rIdvsrwh5m3l-iuk0z3wq4ti">
         <w:r>
           <w:rPr>
             <w:rStyle w:val="Hyperlink"/>
@@ -4610,7 +4526,7 @@
         </w:rPr>
         <w:t xml:space="preserve">, Article 525. </w:t>
       </w:r>
-      <w:hyperlink w:history="1" r:id="rIdc9x1yjs0m26axcwmjfglt">
+      <w:hyperlink w:history="1" r:id="rIdviwqe3g5g58jdhtufigz6">
         <w:r>
           <w:rPr>
             <w:rStyle w:val="Hyperlink"/>
@@ -4652,7 +4568,7 @@
         </w:rPr>
         <w:t xml:space="preserve">(4), 1068–1092. </w:t>
       </w:r>
-      <w:hyperlink w:history="1" r:id="rId5jnwe4s0ouc7bs7acxq4v">
+      <w:hyperlink w:history="1" r:id="rIdcoboswsmj8ashxqkcj4_a">
         <w:r>
           <w:rPr>
             <w:rStyle w:val="Hyperlink"/>
@@ -4694,7 +4610,7 @@
         </w:rPr>
         <w:t xml:space="preserve">(1), Article 1306. </w:t>
       </w:r>
-      <w:hyperlink w:history="1" r:id="rIdjbfqdm5fvykiss1r_mjzw">
+      <w:hyperlink w:history="1" r:id="rIdalf-vbejbt-xamiox6pj1">
         <w:r>
           <w:rPr>
             <w:rStyle w:val="Hyperlink"/>

</xml_diff>

<commit_message>
Complete deep-research Verify phase on secondary claims
Ran 3-vote adversarial verification over 16 previously single-checked
claims (2026 additions + title-led preprints + single-sourced stats).
Result: 14 confirmed 3/3, none killed; applied accuracy fixes:
- Alqurni (2026): removed overstated trust->self-efficacy link (all
  voters noted trust had no direct effect); now stated accurately
- Levels-of-Autonomy: replaced imprecise 'L0-L5' with the paper's
  actual five-level operator-to-observer framing
Confirmed the mis-sourced '1 in 5 / JMIR' mental-health stat was never
in the manuscript (caught at research stage).

https://claude.ai/code/session_01YW6bjEw6DSrD5H7JmH8dwe
</commit_message>
<xml_diff>
--- a/Agentic-AI-in-Education-Narrative-Review.docx
+++ b/Agentic-AI-in-Education-Narrative-Review.docx
@@ -534,7 +534,7 @@
         <w:rPr>
           <w:rFonts w:ascii="Times New Roman" w:cs="Times New Roman" w:eastAsia="Times New Roman" w:hAnsi="Times New Roman"/>
         </w:rPr>
-        <w:t xml:space="preserve">Education-specific frameworks are emerging but remain unstandardised. The APCP framework charts four escalating levels of agency in collaborative learning—AI as Adaptive Instrument, Proactive Assistant, Co-Learner, and Peer Collaborator—grounded in sociocultural and computer-supported collaborative learning (CSCL) theory (Yan, 2025). A complementary task-centric taxonomy divides educational large language model (LLM) agents into teaching-assistance and student-support agents over a shared architecture of perception, profiling, memory, reasoning, and action (Chu et al., 2025). General-purpose levels-of-autonomy scales (L0–L5) exist but are not education-specific (Levels of Autonomy for AI Agents, 2025).</w:t>
+        <w:t xml:space="preserve">Education-specific frameworks are emerging but remain unstandardised. The APCP framework charts four escalating levels of agency in collaborative learning—AI as Adaptive Instrument, Proactive Assistant, Co-Learner, and Peer Collaborator—grounded in sociocultural and computer-supported collaborative learning (CSCL) theory (Yan, 2025). A complementary task-centric taxonomy divides educational large language model (LLM) agents into teaching-assistance and student-support agents over a shared architecture of perception, profiling, memory, reasoning, and action (Chu et al., 2025). General-purpose levels-of-autonomy scales—spanning five graduated levels from operator to fully autonomous observer, and explicitly decoupled from model capability—exist but are not education-specific (Levels of Autonomy for AI Agents, 2025).</w:t>
       </w:r>
     </w:p>
     <w:p>
@@ -655,7 +655,7 @@
         <w:rPr>
           <w:rFonts w:ascii="Times New Roman" w:cs="Times New Roman" w:eastAsia="Times New Roman" w:hAnsi="Times New Roman"/>
         </w:rPr>
-        <w:t xml:space="preserve">Synthesis across the deployment literature identifies six recurrent pedagogical roles, summarised in Table 1. Beyond the functional role a system occupies, its perceived agency also shapes learner psychology: a 2026 study found that students’ perceptions of AI agency, together with trust and autonomy support, predicted self-efficacy and self-learning motivation in higher education (Alqurni, 2026).</w:t>
+        <w:t xml:space="preserve">Synthesis across the deployment literature identifies six recurrent pedagogical roles, summarised in Table 1. Beyond the functional role a system occupies, its perceived agency also shapes learner psychology: a 2026 study found that students’ perceptions of AI agency and autonomy support predicted self-efficacy and self-learning motivation in higher education, although trust did not directly predict self-efficacy (Alqurni, 2026).</w:t>
       </w:r>
     </w:p>
     <w:tbl>
@@ -3224,7 +3224,7 @@
         </w:rPr>
         <w:t xml:space="preserve"> [Preprint]. arXiv:2502.00289. </w:t>
       </w:r>
-      <w:hyperlink w:history="1" r:id="rIdzjeyalsrcciqhyqe_1mi8">
+      <w:hyperlink w:history="1" r:id="rIdjin8jr1ipqw1xncu6xh_i">
         <w:r>
           <w:rPr>
             <w:rStyle w:val="Hyperlink"/>
@@ -3266,7 +3266,7 @@
         </w:rPr>
         <w:t xml:space="preserve">, Article 1738774. </w:t>
       </w:r>
-      <w:hyperlink w:history="1" r:id="rId7puler2ewczsbh4sagi7g">
+      <w:hyperlink w:history="1" r:id="rIdxcmpngysrrxacut5-msy0">
         <w:r>
           <w:rPr>
             <w:rStyle w:val="Hyperlink"/>
@@ -3308,7 +3308,7 @@
         </w:rPr>
         <w:t xml:space="preserve">(26), e2422633122. </w:t>
       </w:r>
-      <w:hyperlink w:history="1" r:id="rIdcbflyhkatc5pxd_yp4iem">
+      <w:hyperlink w:history="1" r:id="rId7vzsraawks-c3wnlfxmdk">
         <w:r>
           <w:rPr>
             <w:rStyle w:val="Hyperlink"/>
@@ -3350,7 +3350,7 @@
         </w:rPr>
         <w:t xml:space="preserve">(4), Article 296. </w:t>
       </w:r>
-      <w:hyperlink w:history="1" r:id="rIdnjevqar2tkxmqeobqifk5">
+      <w:hyperlink w:history="1" r:id="rIdi9yi2knq5vjajm4acwwcf">
         <w:r>
           <w:rPr>
             <w:rStyle w:val="Hyperlink"/>
@@ -3392,7 +3392,7 @@
         </w:rPr>
         <w:t xml:space="preserve">. Advance online publication. </w:t>
       </w:r>
-      <w:hyperlink w:history="1" r:id="rIdllnrzw5kxvijkep3pvus9">
+      <w:hyperlink w:history="1" r:id="rIdm0duk3xr-9z2hpqax6j1u">
         <w:r>
           <w:rPr>
             <w:rStyle w:val="Hyperlink"/>
@@ -3434,7 +3434,7 @@
         </w:rPr>
         <w:t xml:space="preserve"> (pp. 13782–13810). Association for Computational Linguistics. </w:t>
       </w:r>
-      <w:hyperlink w:history="1" r:id="rIdvf_dfiuerdiycrty_pagq">
+      <w:hyperlink w:history="1" r:id="rId8quqmdmddnd6ypxfmtqzi">
         <w:r>
           <w:rPr>
             <w:rStyle w:val="Hyperlink"/>
@@ -3476,7 +3476,7 @@
         </w:rPr>
         <w:t xml:space="preserve"> (Policy Research Working Paper No. 11125). World Bank. </w:t>
       </w:r>
-      <w:hyperlink w:history="1" r:id="rIdl5umpbjkru1swtrwmtcl1">
+      <w:hyperlink w:history="1" r:id="rIdcbp0sgfr8hydz7zx6_sul">
         <w:r>
           <w:rPr>
             <w:rStyle w:val="Hyperlink"/>
@@ -3518,7 +3518,7 @@
         </w:rPr>
         <w:t xml:space="preserve">. Official Journal of the European Union, L 2024/1689. </w:t>
       </w:r>
-      <w:hyperlink w:history="1" r:id="rIddjfr4ddtdaxdsdrkksuol">
+      <w:hyperlink w:history="1" r:id="rId7xi3xqgkxtof5q-c1o_-y">
         <w:r>
           <w:rPr>
             <w:rStyle w:val="Hyperlink"/>
@@ -3560,7 +3560,7 @@
         </w:rPr>
         <w:t xml:space="preserve">(2), 489–530. </w:t>
       </w:r>
-      <w:hyperlink w:history="1" r:id="rIdldylte9kdivjibeapv09e">
+      <w:hyperlink w:history="1" r:id="rIdyya_wj3tvrjo5xqmartyo">
         <w:r>
           <w:rPr>
             <w:rStyle w:val="Hyperlink"/>
@@ -3602,7 +3602,7 @@
         </w:rPr>
         <w:t xml:space="preserve">. Georgia Tech Research News. </w:t>
       </w:r>
-      <w:hyperlink w:history="1" r:id="rIdip1s3vsi4cxo7fauh_5f9">
+      <w:hyperlink w:history="1" r:id="rIdufnokzpwvjnclikjwjwpd">
         <w:r>
           <w:rPr>
             <w:rStyle w:val="Hyperlink"/>
@@ -3644,7 +3644,7 @@
         </w:rPr>
         <w:t xml:space="preserve"> [Preprint]. arXiv:2603.20056. </w:t>
       </w:r>
-      <w:hyperlink w:history="1" r:id="rIdxtkz1jpfir4wpqbyaqr0z">
+      <w:hyperlink w:history="1" r:id="rIdm0t5ynwwz9p9ml5-fjtsc">
         <w:r>
           <w:rPr>
             <w:rStyle w:val="Hyperlink"/>
@@ -3686,7 +3686,7 @@
         </w:rPr>
         <w:t xml:space="preserve">. Advance online publication. </w:t>
       </w:r>
-      <w:hyperlink w:history="1" r:id="rIdgmzjhnifbdtb4s-oc2t_8">
+      <w:hyperlink w:history="1" r:id="rIdsgqr1xpowu8tqijti_be9">
         <w:r>
           <w:rPr>
             <w:rStyle w:val="Hyperlink"/>
@@ -3728,7 +3728,7 @@
         </w:rPr>
         <w:t xml:space="preserve"> [Preprint]. arXiv:2504.20082. </w:t>
       </w:r>
-      <w:hyperlink w:history="1" r:id="rIdes4j5ad6wt3g4rkapb4t2">
+      <w:hyperlink w:history="1" r:id="rIdpym6bgy7chkcfy-p0zyhq">
         <w:r>
           <w:rPr>
             <w:rStyle w:val="Hyperlink"/>
@@ -3770,7 +3770,7 @@
         </w:rPr>
         <w:t xml:space="preserve">, Article 17458. </w:t>
       </w:r>
-      <w:hyperlink w:history="1" r:id="rIdq0j-ga4ef3ns0lgrpdfq9">
+      <w:hyperlink w:history="1" r:id="rIdulmxygfztuegwl2wsj860">
         <w:r>
           <w:rPr>
             <w:rStyle w:val="Hyperlink"/>
@@ -3812,7 +3812,7 @@
         </w:rPr>
         <w:t xml:space="preserve"> [Preprint]. arXiv:2506.08872. </w:t>
       </w:r>
-      <w:hyperlink w:history="1" r:id="rId81agjpgqkwomc00y8rj2f">
+      <w:hyperlink w:history="1" r:id="rId96t_ek330htare5ot5tma">
         <w:r>
           <w:rPr>
             <w:rStyle w:val="Hyperlink"/>
@@ -3854,7 +3854,7 @@
         </w:rPr>
         <w:t xml:space="preserve"> [Preprint]. arXiv:2506.12469. </w:t>
       </w:r>
-      <w:hyperlink w:history="1" r:id="rIdqhc60etmll8xe6mv8epyl">
+      <w:hyperlink w:history="1" r:id="rId79xhhnqtrwsq1b0jh264v">
         <w:r>
           <w:rPr>
             <w:rStyle w:val="Hyperlink"/>
@@ -3896,7 +3896,7 @@
         </w:rPr>
         <w:t xml:space="preserve"> [Preprint]. arXiv:2601.06818. </w:t>
       </w:r>
-      <w:hyperlink w:history="1" r:id="rId5shpi7vwcslczqxslptgn">
+      <w:hyperlink w:history="1" r:id="rId-xo20tssfbpxes27_2i8y">
         <w:r>
           <w:rPr>
             <w:rStyle w:val="Hyperlink"/>
@@ -3938,7 +3938,7 @@
         </w:rPr>
         <w:t xml:space="preserve">(4), e70096. </w:t>
       </w:r>
-      <w:hyperlink w:history="1" r:id="rIdcr2vur1x00cgwmeefsskg">
+      <w:hyperlink w:history="1" r:id="rIdnziwnw-cm7xunhz3u8a-g">
         <w:r>
           <w:rPr>
             <w:rStyle w:val="Hyperlink"/>
@@ -3980,7 +3980,7 @@
         </w:rPr>
         <w:t xml:space="preserve">, Article 1729059. </w:t>
       </w:r>
-      <w:hyperlink w:history="1" r:id="rIdfak1yj4su459yton7idhh">
+      <w:hyperlink w:history="1" r:id="rIdhrvcjuxzob33zaxsqkzcb">
         <w:r>
           <w:rPr>
             <w:rStyle w:val="Hyperlink"/>
@@ -4022,7 +4022,7 @@
         </w:rPr>
         <w:t xml:space="preserve">, Article 1759027. </w:t>
       </w:r>
-      <w:hyperlink w:history="1" r:id="rIds4yresemc4oabng0aokr3">
+      <w:hyperlink w:history="1" r:id="rIdoge7bnny-7d4qbugvswjx">
         <w:r>
           <w:rPr>
             <w:rStyle w:val="Hyperlink"/>
@@ -4064,7 +4064,7 @@
         </w:rPr>
         <w:t xml:space="preserve">. OECD Publishing. </w:t>
       </w:r>
-      <w:hyperlink w:history="1" r:id="rIdf72ohlo7qkdhyvtwwzaro">
+      <w:hyperlink w:history="1" r:id="rIddsj59pbri9gia7mothjhm">
         <w:r>
           <w:rPr>
             <w:rStyle w:val="Hyperlink"/>
@@ -4106,7 +4106,7 @@
         </w:rPr>
         <w:t xml:space="preserve"> [Preprint]. arXiv:2509.14803. </w:t>
       </w:r>
-      <w:hyperlink w:history="1" r:id="rId5vzzjpmnv_ncpryhtxfcv">
+      <w:hyperlink w:history="1" r:id="rIdcnmehhdvst-nayyx4dnws">
         <w:r>
           <w:rPr>
             <w:rStyle w:val="Hyperlink"/>
@@ -4148,7 +4148,7 @@
         </w:rPr>
         <w:t xml:space="preserve">, Article 103599. </w:t>
       </w:r>
-      <w:hyperlink w:history="1" r:id="rId5_jibtrh9s95w-eyzuxua">
+      <w:hyperlink w:history="1" r:id="rIdpyvaubj617x4ji_jjwpsl">
         <w:r>
           <w:rPr>
             <w:rStyle w:val="Hyperlink"/>
@@ -4190,7 +4190,7 @@
         </w:rPr>
         <w:t xml:space="preserve"> [Preprint]. arXiv:2602.17671. </w:t>
       </w:r>
-      <w:hyperlink w:history="1" r:id="rId9asqyajukcg19idmeqdhq">
+      <w:hyperlink w:history="1" r:id="rIdxpvowhzjjqas6d386fwjj">
         <w:r>
           <w:rPr>
             <w:rStyle w:val="Hyperlink"/>
@@ -4232,7 +4232,7 @@
         </w:rPr>
         <w:t xml:space="preserve">(4), 155–178. </w:t>
       </w:r>
-      <w:hyperlink w:history="1" r:id="rIdtupxpsjdh98w5gghi2vbi">
+      <w:hyperlink w:history="1" r:id="rIdqukgs2ugddvr-pq7w5l9x">
         <w:r>
           <w:rPr>
             <w:rStyle w:val="Hyperlink"/>
@@ -4274,7 +4274,7 @@
         </w:rPr>
         <w:t xml:space="preserve"> [Preprint]. arXiv:2508.16659. </w:t>
       </w:r>
-      <w:hyperlink w:history="1" r:id="rIdg0kazcvp1oakxjgqyszjq">
+      <w:hyperlink w:history="1" r:id="rId5sywcix6rxkoftzko4a6y">
         <w:r>
           <w:rPr>
             <w:rStyle w:val="Hyperlink"/>
@@ -4316,7 +4316,7 @@
         </w:rPr>
         <w:t xml:space="preserve"> [Preprint]. arXiv:2510.03884. </w:t>
       </w:r>
-      <w:hyperlink w:history="1" r:id="rIdcpcpce0assktfpszm5o7r">
+      <w:hyperlink w:history="1" r:id="rIdgxkfktmfzif7etu3z_i8g">
         <w:r>
           <w:rPr>
             <w:rStyle w:val="Hyperlink"/>
@@ -4358,7 +4358,7 @@
         </w:rPr>
         <w:t xml:space="preserve"> (F. Miao &amp; W. Holmes, Authors). </w:t>
       </w:r>
-      <w:hyperlink w:history="1" r:id="rIdccasqtqzwhpopcafoqvml">
+      <w:hyperlink w:history="1" r:id="rId834ho0w_k375-zt3bljkx">
         <w:r>
           <w:rPr>
             <w:rStyle w:val="Hyperlink"/>
@@ -4400,7 +4400,7 @@
         </w:rPr>
         <w:t xml:space="preserve">. </w:t>
       </w:r>
-      <w:hyperlink w:history="1" r:id="rIdz6b0zweeehohl-7trtsza">
+      <w:hyperlink w:history="1" r:id="rIdqg_xle9mslay-p_z8catr">
         <w:r>
           <w:rPr>
             <w:rStyle w:val="Hyperlink"/>
@@ -4442,7 +4442,7 @@
         </w:rPr>
         <w:t xml:space="preserve">. Retrieved 2026, from </w:t>
       </w:r>
-      <w:hyperlink w:history="1" r:id="rIdxvdj7p5qs8wumrjsu4cwm">
+      <w:hyperlink w:history="1" r:id="rIdh3rja5npma-w6yx_fysgc">
         <w:r>
           <w:rPr>
             <w:rStyle w:val="Hyperlink"/>
@@ -4484,7 +4484,7 @@
         </w:rPr>
         <w:t xml:space="preserve"> [Preprint]. arXiv:2508.14825. </w:t>
       </w:r>
-      <w:hyperlink w:history="1" r:id="rIdvsrwh5m3l-iuk0z3wq4ti">
+      <w:hyperlink w:history="1" r:id="rIdxdu18gt-v6ngntvihbidj">
         <w:r>
           <w:rPr>
             <w:rStyle w:val="Hyperlink"/>
@@ -4526,7 +4526,7 @@
         </w:rPr>
         <w:t xml:space="preserve">, Article 525. </w:t>
       </w:r>
-      <w:hyperlink w:history="1" r:id="rIdviwqe3g5g58jdhtufigz6">
+      <w:hyperlink w:history="1" r:id="rIdnfvrmf7gcevmulp2jqw0j">
         <w:r>
           <w:rPr>
             <w:rStyle w:val="Hyperlink"/>
@@ -4568,7 +4568,7 @@
         </w:rPr>
         <w:t xml:space="preserve">(4), 1068–1092. </w:t>
       </w:r>
-      <w:hyperlink w:history="1" r:id="rIdcoboswsmj8ashxqkcj4_a">
+      <w:hyperlink w:history="1" r:id="rIdsesjbgsmnu9brnetye7c5">
         <w:r>
           <w:rPr>
             <w:rStyle w:val="Hyperlink"/>
@@ -4610,7 +4610,7 @@
         </w:rPr>
         <w:t xml:space="preserve">(1), Article 1306. </w:t>
       </w:r>
-      <w:hyperlink w:history="1" r:id="rIdalf-vbejbt-xamiox6pj1">
+      <w:hyperlink w:history="1" r:id="rIdhc02ncwzum7gqkcnfs1cl">
         <w:r>
           <w:rPr>
             <w:rStyle w:val="Hyperlink"/>

</xml_diff>